<commit_message>
updates to PvSal1 annotation maps
</commit_message>
<xml_diff>
--- a/README.DuffyNGS.Pipeline.docx
+++ b/README.DuffyNGS.Pipeline.docx
@@ -1,6 +1,6 @@
 
 <file path=word/document.xml><?xml version="1.0" encoding="utf-8"?>
-<w:document xmlns:wpc="http://schemas.microsoft.com/office/word/2010/wordprocessingCanvas" xmlns:cx="http://schemas.microsoft.com/office/drawing/2014/chartex" xmlns:cx1="http://schemas.microsoft.com/office/drawing/2015/9/8/chartex" xmlns:cx2="http://schemas.microsoft.com/office/drawing/2015/10/21/chartex" xmlns:cx3="http://schemas.microsoft.com/office/drawing/2016/5/9/chartex" xmlns:cx4="http://schemas.microsoft.com/office/drawing/2016/5/10/chartex" xmlns:cx5="http://schemas.microsoft.com/office/drawing/2016/5/11/chartex" xmlns:cx6="http://schemas.microsoft.com/office/drawing/2016/5/12/chartex" xmlns:cx7="http://schemas.microsoft.com/office/drawing/2016/5/13/chartex" xmlns:cx8="http://schemas.microsoft.com/office/drawing/2016/5/14/chartex" xmlns:mc="http://schemas.openxmlformats.org/markup-compatibility/2006" xmlns:aink="http://schemas.microsoft.com/office/drawing/2016/ink" xmlns:am3d="http://schemas.microsoft.com/office/drawing/2017/model3d" xmlns:o="urn:schemas-microsoft-com:office:office" xmlns:oel="http://schemas.microsoft.com/office/2019/extlst" xmlns:r="http://schemas.openxmlformats.org/officeDocument/2006/relationships" xmlns:m="http://schemas.openxmlformats.org/officeDocument/2006/math" xmlns:v="urn:schemas-microsoft-com:vml" xmlns:wp14="http://schemas.microsoft.com/office/word/2010/wordprocessingDrawing" xmlns:wp="http://schemas.openxmlformats.org/drawingml/2006/wordprocessingDrawing" xmlns:w10="urn:schemas-microsoft-com:office:word" xmlns:w="http://schemas.openxmlformats.org/wordprocessingml/2006/main" xmlns:w14="http://schemas.microsoft.com/office/word/2010/wordml" xmlns:w15="http://schemas.microsoft.com/office/word/2012/wordml" xmlns:w16cex="http://schemas.microsoft.com/office/word/2018/wordml/cex" xmlns:w16cid="http://schemas.microsoft.com/office/word/2016/wordml/cid" xmlns:w16="http://schemas.microsoft.com/office/word/2018/wordml" xmlns:w16sdtdh="http://schemas.microsoft.com/office/word/2020/wordml/sdtdatahash" xmlns:w16se="http://schemas.microsoft.com/office/word/2015/wordml/symex" xmlns:wpg="http://schemas.microsoft.com/office/word/2010/wordprocessingGroup" xmlns:wpi="http://schemas.microsoft.com/office/word/2010/wordprocessingInk" xmlns:wne="http://schemas.microsoft.com/office/word/2006/wordml" xmlns:wps="http://schemas.microsoft.com/office/word/2010/wordprocessingShape" mc:Ignorable="w14 w15 w16se w16cid w16 w16cex w16sdtdh wp14">
+<w:document xmlns:wpc="http://schemas.microsoft.com/office/word/2010/wordprocessingCanvas" xmlns:cx="http://schemas.microsoft.com/office/drawing/2014/chartex" xmlns:cx1="http://schemas.microsoft.com/office/drawing/2015/9/8/chartex" xmlns:cx2="http://schemas.microsoft.com/office/drawing/2015/10/21/chartex" xmlns:cx3="http://schemas.microsoft.com/office/drawing/2016/5/9/chartex" xmlns:cx4="http://schemas.microsoft.com/office/drawing/2016/5/10/chartex" xmlns:cx5="http://schemas.microsoft.com/office/drawing/2016/5/11/chartex" xmlns:cx6="http://schemas.microsoft.com/office/drawing/2016/5/12/chartex" xmlns:cx7="http://schemas.microsoft.com/office/drawing/2016/5/13/chartex" xmlns:cx8="http://schemas.microsoft.com/office/drawing/2016/5/14/chartex" xmlns:mc="http://schemas.openxmlformats.org/markup-compatibility/2006" xmlns:aink="http://schemas.microsoft.com/office/drawing/2016/ink" xmlns:am3d="http://schemas.microsoft.com/office/drawing/2017/model3d" xmlns:o="urn:schemas-microsoft-com:office:office" xmlns:oel="http://schemas.microsoft.com/office/2019/extlst" xmlns:r="http://schemas.openxmlformats.org/officeDocument/2006/relationships" xmlns:m="http://schemas.openxmlformats.org/officeDocument/2006/math" xmlns:v="urn:schemas-microsoft-com:vml" xmlns:wp14="http://schemas.microsoft.com/office/word/2010/wordprocessingDrawing" xmlns:wp="http://schemas.openxmlformats.org/drawingml/2006/wordprocessingDrawing" xmlns:w10="urn:schemas-microsoft-com:office:word" xmlns:w="http://schemas.openxmlformats.org/wordprocessingml/2006/main" xmlns:w14="http://schemas.microsoft.com/office/word/2010/wordml" xmlns:w15="http://schemas.microsoft.com/office/word/2012/wordml" xmlns:w16cex="http://schemas.microsoft.com/office/word/2018/wordml/cex" xmlns:w16cid="http://schemas.microsoft.com/office/word/2016/wordml/cid" xmlns:w16="http://schemas.microsoft.com/office/word/2018/wordml" xmlns:w16du="http://schemas.microsoft.com/office/word/2023/wordml/word16du" xmlns:w16sdtdh="http://schemas.microsoft.com/office/word/2020/wordml/sdtdatahash" xmlns:w16sdtfl="http://schemas.microsoft.com/office/word/2024/wordml/sdtformatlock" xmlns:w16se="http://schemas.microsoft.com/office/word/2015/wordml/symex" xmlns:wpg="http://schemas.microsoft.com/office/word/2010/wordprocessingGroup" xmlns:wpi="http://schemas.microsoft.com/office/word/2010/wordprocessingInk" xmlns:wne="http://schemas.microsoft.com/office/word/2006/wordml" xmlns:wps="http://schemas.microsoft.com/office/word/2010/wordprocessingShape" mc:Ignorable="w14 w15 w16se w16cid w16 w16cex w16sdtdh w16sdtfl w16du wp14">
   <w:body>
     <w:p>
       <w:pPr>
@@ -390,14 +390,22 @@
         <w:t>’</w:t>
       </w:r>
       <w:r>
-        <w:t xml:space="preserve"> from the Unix command line, or via</w:t>
-      </w:r>
-      <w:r>
-        <w:t xml:space="preserve">: </w:t>
-      </w:r>
+        <w:t xml:space="preserve"> from the Unix command line, or </w:t>
+      </w:r>
+      <w:proofErr w:type="gramStart"/>
+      <w:r>
+        <w:t>via</w:t>
+      </w:r>
+      <w:r>
+        <w:t>:</w:t>
+      </w:r>
+      <w:proofErr w:type="gramEnd"/>
       <w:r>
         <w:t xml:space="preserve"> </w:t>
       </w:r>
+      <w:r>
+        <w:t xml:space="preserve"> </w:t>
+      </w:r>
       <w:proofErr w:type="spellStart"/>
       <w:proofErr w:type="gramStart"/>
       <w:r>
@@ -408,13 +416,20 @@
         <w:t>install.packages</w:t>
       </w:r>
       <w:proofErr w:type="spellEnd"/>
-      <w:proofErr w:type="gramEnd"/>
       <w:r>
         <w:rPr>
           <w:rFonts w:ascii="Courier New" w:hAnsi="Courier New" w:cs="Courier New"/>
           <w:sz w:val="22"/>
         </w:rPr>
-        <w:t>( …, repos=NULL, …)</w:t>
+        <w:t>( …</w:t>
+      </w:r>
+      <w:proofErr w:type="gramEnd"/>
+      <w:r>
+        <w:rPr>
+          <w:rFonts w:ascii="Courier New" w:hAnsi="Courier New" w:cs="Courier New"/>
+          <w:sz w:val="22"/>
+        </w:rPr>
+        <w:t>, repos=NULL, …)</w:t>
       </w:r>
       <w:r>
         <w:rPr>
@@ -608,21 +623,7 @@
         <w:rPr>
           <w:rFonts w:cs="Courier New"/>
         </w:rPr>
-        <w:t xml:space="preserve">file manipulation tools, </w:t>
-      </w:r>
-      <w:proofErr w:type="gramStart"/>
-      <w:r>
-        <w:rPr>
-          <w:rFonts w:cs="Courier New"/>
-        </w:rPr>
-        <w:t>etc.;</w:t>
-      </w:r>
-      <w:proofErr w:type="gramEnd"/>
-      <w:r>
-        <w:rPr>
-          <w:rFonts w:cs="Courier New"/>
-        </w:rPr>
-        <w:t xml:space="preserve"> </w:t>
+        <w:t xml:space="preserve">file manipulation tools, etc.; </w:t>
       </w:r>
       <w:r>
         <w:rPr>
@@ -880,10 +881,18 @@
         <w:t xml:space="preserve"> tools</w:t>
       </w:r>
       <w:r>
-        <w:t>, include</w:t>
-      </w:r>
-      <w:r>
-        <w:t xml:space="preserve">: </w:t>
+        <w:t xml:space="preserve">, </w:t>
+      </w:r>
+      <w:proofErr w:type="gramStart"/>
+      <w:r>
+        <w:t>include</w:t>
+      </w:r>
+      <w:r>
+        <w:t>:</w:t>
+      </w:r>
+      <w:proofErr w:type="gramEnd"/>
+      <w:r>
+        <w:t xml:space="preserve"> </w:t>
       </w:r>
       <w:r>
         <w:t xml:space="preserve"> VELVET, Python, </w:t>
@@ -1558,7 +1567,15 @@
       </w:r>
       <w:proofErr w:type="gramEnd"/>
       <w:r>
-        <w:t xml:space="preserve">or similar):   An </w:t>
+        <w:t xml:space="preserve">or similar):   </w:t>
+      </w:r>
+      <w:proofErr w:type="gramStart"/>
+      <w:r>
+        <w:t>An</w:t>
+      </w:r>
+      <w:proofErr w:type="gramEnd"/>
+      <w:r>
+        <w:t xml:space="preserve"> </w:t>
       </w:r>
       <w:r>
         <w:t xml:space="preserve">small </w:t>
@@ -1572,22 +1589,32 @@
       <w:r>
         <w:t xml:space="preserve">via </w:t>
       </w:r>
+      <w:proofErr w:type="gramStart"/>
       <w:r>
         <w:rPr>
           <w:rFonts w:ascii="Courier New" w:hAnsi="Courier New" w:cs="Courier New"/>
           <w:sz w:val="22"/>
         </w:rPr>
-        <w:t>source(“</w:t>
-      </w:r>
-      <w:proofErr w:type="spellStart"/>
+        <w:t>source(</w:t>
+      </w:r>
+      <w:proofErr w:type="gramEnd"/>
       <w:r>
         <w:rPr>
           <w:rFonts w:ascii="Courier New" w:hAnsi="Courier New" w:cs="Courier New"/>
           <w:sz w:val="22"/>
         </w:rPr>
+        <w:t>“</w:t>
+      </w:r>
+      <w:proofErr w:type="spellStart"/>
+      <w:r>
+        <w:rPr>
+          <w:rFonts w:ascii="Courier New" w:hAnsi="Courier New" w:cs="Courier New"/>
+          <w:sz w:val="22"/>
+        </w:rPr>
         <w:t>pipelineSetup.R</w:t>
       </w:r>
       <w:proofErr w:type="spellEnd"/>
+      <w:proofErr w:type="gramStart"/>
       <w:r>
         <w:rPr>
           <w:rFonts w:ascii="Courier New" w:hAnsi="Courier New" w:cs="Courier New"/>
@@ -1599,7 +1626,11 @@
         <w:t xml:space="preserve">  </w:t>
       </w:r>
       <w:r>
-        <w:t>as the very first command in every R session/job,</w:t>
+        <w:t>as</w:t>
+      </w:r>
+      <w:proofErr w:type="gramEnd"/>
+      <w:r>
+        <w:t xml:space="preserve"> the very first command in every R session/job,</w:t>
       </w:r>
       <w:r>
         <w:t xml:space="preserve"> that loads the </w:t>
@@ -1610,7 +1641,15 @@
       </w:r>
       <w:proofErr w:type="spellEnd"/>
       <w:r>
-        <w:t xml:space="preserve"> library,  sets the default </w:t>
+        <w:t xml:space="preserve"> </w:t>
+      </w:r>
+      <w:proofErr w:type="gramStart"/>
+      <w:r>
+        <w:t>library,  sets</w:t>
+      </w:r>
+      <w:proofErr w:type="gramEnd"/>
+      <w:r>
+        <w:t xml:space="preserve"> the default </w:t>
       </w:r>
       <w:proofErr w:type="spellStart"/>
       <w:r>
@@ -1662,10 +1701,18 @@
       </w:r>
       <w:proofErr w:type="spellEnd"/>
       <w:r>
-        <w:t xml:space="preserve">-seq &amp; RIP-seq only)  </w:t>
-      </w:r>
-      <w:r>
-        <w:t>multiPeakPick.sh, multiPeakDraw.sh, peakpick.sh, peakdraw.sh:   additional shell scripts for the peak picking a</w:t>
+        <w:t xml:space="preserve">-seq &amp; RIP-seq </w:t>
+      </w:r>
+      <w:proofErr w:type="gramStart"/>
+      <w:r>
+        <w:t xml:space="preserve">only)  </w:t>
+      </w:r>
+      <w:r>
+        <w:t>multiPeakPick.sh</w:t>
+      </w:r>
+      <w:proofErr w:type="gramEnd"/>
+      <w:r>
+        <w:t>, multiPeakDraw.sh, peakpick.sh, peakdraw.sh:   additional shell scripts for the peak picking a</w:t>
       </w:r>
       <w:r>
         <w:t>nd peak drawing pipeline steps.  These steps may need to be repeated to allow inter-sample scaling, after all samples have been processed.</w:t>
@@ -1781,7 +1828,15 @@
       </w:r>
       <w:proofErr w:type="gramEnd"/>
       <w:r>
-        <w:t xml:space="preserve">or similar), perhaps customized to a particular sequencing center’s file naming conventions.  It can be run to merge and compress multi-part FASTQ files to convert them to the </w:t>
+        <w:t xml:space="preserve">or similar), perhaps customized to a particular sequencing center’s file naming </w:t>
+      </w:r>
+      <w:proofErr w:type="gramStart"/>
+      <w:r>
+        <w:t>conventions</w:t>
+      </w:r>
+      <w:proofErr w:type="gramEnd"/>
+      <w:r>
+        <w:t xml:space="preserve">.  It can be run to merge and compress multi-part FASTQ files to convert them to the </w:t>
       </w:r>
       <w:proofErr w:type="spellStart"/>
       <w:r>
@@ -2605,15 +2660,7 @@
       </w:r>
       <w:proofErr w:type="spellEnd"/>
       <w:r>
-        <w:t xml:space="preserve"> quality control pipeline step on a sample.  To successfully run, all the installed software, folder paths, </w:t>
-      </w:r>
-      <w:proofErr w:type="gramStart"/>
-      <w:r>
-        <w:t>system</w:t>
-      </w:r>
-      <w:proofErr w:type="gramEnd"/>
-      <w:r>
-        <w:t xml:space="preserve"> and program settings, etc., need to be correctly configured.  </w:t>
+        <w:t xml:space="preserve"> quality control pipeline step on a sample.  To successfully run, all the installed software, folder paths, system and program settings, etc., need to be correctly configured.  </w:t>
       </w:r>
       <w:r>
         <w:t xml:space="preserve">  It tends to be an iterative, trial and error process involving:</w:t>
@@ -2738,7 +2785,6 @@
         <w:t>pipe.QuickQC</w:t>
       </w:r>
       <w:proofErr w:type="spellEnd"/>
-      <w:proofErr w:type="gramEnd"/>
       <w:r>
         <w:rPr>
           <w:rFonts w:ascii="Courier New" w:hAnsi="Courier New" w:cs="Courier New"/>
@@ -2754,6 +2800,7 @@
         <w:t>&lt;</w:t>
       </w:r>
       <w:proofErr w:type="spellStart"/>
+      <w:proofErr w:type="gramEnd"/>
       <w:r>
         <w:rPr>
           <w:rFonts w:ascii="Courier New" w:hAnsi="Courier New" w:cs="Courier New"/>
@@ -2762,6 +2809,7 @@
         <w:t>sampleID</w:t>
       </w:r>
       <w:proofErr w:type="spellEnd"/>
+      <w:proofErr w:type="gramStart"/>
       <w:r>
         <w:rPr>
           <w:rFonts w:ascii="Courier New" w:hAnsi="Courier New" w:cs="Courier New"/>
@@ -2786,7 +2834,14 @@
         <w:rPr>
           <w:sz w:val="22"/>
         </w:rPr>
-        <w:t xml:space="preserve"> where the sample ID is one character string that must match one row entry in the “Annotation.txt” file.</w:t>
+        <w:t xml:space="preserve"> where</w:t>
+      </w:r>
+      <w:proofErr w:type="gramEnd"/>
+      <w:r>
+        <w:rPr>
+          <w:sz w:val="22"/>
+        </w:rPr>
+        <w:t xml:space="preserve"> the sample ID is one character string that must match one row entry in the “Annotation.txt” file.</w:t>
       </w:r>
     </w:p>
     <w:p>
@@ -3105,15 +3160,7 @@
         <w:t xml:space="preserve"> Hit’ reads</w:t>
       </w:r>
       <w:r>
-        <w:t xml:space="preserve"> </w:t>
-      </w:r>
-      <w:proofErr w:type="gramStart"/>
-      <w:r>
-        <w:t>is</w:t>
-      </w:r>
-      <w:proofErr w:type="gramEnd"/>
-      <w:r>
-        <w:t xml:space="preserve"> a warning that the current target organism is not a good enough match to the raw data.  Typical reasons include:  </w:t>
+        <w:t xml:space="preserve"> is a warning that the current target organism is not a good enough match to the raw data.  Typical reasons include:  </w:t>
       </w:r>
       <w:r>
         <w:t xml:space="preserve">a large fraction of some second organism </w:t>
@@ -3452,15 +3499,7 @@
         <w:t>step, only reads aligned to the coding strand are included in the read count and RPKM values.</w:t>
       </w:r>
       <w:r>
-        <w:t xml:space="preserve">  Note that the ‘</w:t>
-      </w:r>
-      <w:proofErr w:type="spellStart"/>
-      <w:r>
-        <w:t>Ribo</w:t>
-      </w:r>
-      <w:proofErr w:type="spellEnd"/>
-      <w:r>
-        <w:t xml:space="preserve"> Clearing’ alignment </w:t>
+        <w:t xml:space="preserve">  Note that the ‘Ribo Clearing’ alignment </w:t>
       </w:r>
       <w:r>
         <w:lastRenderedPageBreak/>
@@ -3485,13 +3524,8 @@
       <w:r>
         <w:t xml:space="preserve"> runtime behavior, since both mates may have unequal </w:t>
       </w:r>
-      <w:proofErr w:type="spellStart"/>
-      <w:r>
-        <w:t>Ribo</w:t>
-      </w:r>
-      <w:proofErr w:type="spellEnd"/>
-      <w:r>
-        <w:t xml:space="preserve"> Clearing </w:t>
+      <w:r>
+        <w:t xml:space="preserve">Ribo Clearing </w:t>
       </w:r>
       <w:r>
         <w:t>alignment outcomes.  Add option “</w:t>
@@ -3587,15 +3621,7 @@
         <w:t>Inside the “multiPipel</w:t>
       </w:r>
       <w:r>
-        <w:t xml:space="preserve">ine.sh” bash script </w:t>
-      </w:r>
-      <w:proofErr w:type="gramStart"/>
-      <w:r>
-        <w:t>are</w:t>
-      </w:r>
-      <w:proofErr w:type="gramEnd"/>
-      <w:r>
-        <w:t xml:space="preserve"> SGE/SLURM/</w:t>
+        <w:t>ine.sh” bash script are SGE/SLURM/</w:t>
       </w:r>
       <w:r>
         <w:t xml:space="preserve">PBS </w:t>
@@ -3930,15 +3956,7 @@
         <w:t xml:space="preserve"> you select resources on the fly.  </w:t>
       </w:r>
       <w:r>
-        <w:t xml:space="preserve">At ISB, for the </w:t>
-      </w:r>
-      <w:proofErr w:type="spellStart"/>
-      <w:r>
-        <w:t>Baliga</w:t>
-      </w:r>
-      <w:proofErr w:type="spellEnd"/>
-      <w:r>
-        <w:t xml:space="preserve"> lab, a typical session is invoked with the command ‘</w:t>
+        <w:t>At ISB, for the Baliga lab, a typical session is invoked with the command ‘</w:t>
       </w:r>
       <w:proofErr w:type="spellStart"/>
       <w:r>
@@ -4829,25 +4847,7 @@
           <w:sz w:val="20"/>
           <w:szCs w:val="20"/>
         </w:rPr>
-        <w:t xml:space="preserve"># </w:t>
-      </w:r>
-      <w:proofErr w:type="gramStart"/>
-      <w:r>
-        <w:rPr>
-          <w:rFonts w:cs="Courier New"/>
-          <w:sz w:val="20"/>
-          <w:szCs w:val="20"/>
-        </w:rPr>
-        <w:t>more</w:t>
-      </w:r>
-      <w:proofErr w:type="gramEnd"/>
-      <w:r>
-        <w:rPr>
-          <w:rFonts w:cs="Courier New"/>
-          <w:sz w:val="20"/>
-          <w:szCs w:val="20"/>
-        </w:rPr>
-        <w:t xml:space="preserve"> typical is to do this step as multiple batch jobs on a cluster</w:t>
+        <w:t># more typical is to do this step as multiple batch jobs on a cluster</w:t>
       </w:r>
     </w:p>
     <w:p>
@@ -4903,8 +4903,18 @@
           <w:sz w:val="20"/>
           <w:szCs w:val="20"/>
         </w:rPr>
-        <w:t>) pipeline( s</w:t>
-      </w:r>
+        <w:t xml:space="preserve">) </w:t>
+      </w:r>
+      <w:proofErr w:type="gramStart"/>
+      <w:r>
+        <w:rPr>
+          <w:rFonts w:ascii="Courier New" w:hAnsi="Courier New" w:cs="Courier New"/>
+          <w:sz w:val="20"/>
+          <w:szCs w:val="20"/>
+        </w:rPr>
+        <w:t>pipeline( s</w:t>
+      </w:r>
+      <w:proofErr w:type="gramEnd"/>
       <w:r>
         <w:rPr>
           <w:rFonts w:ascii="Courier New" w:hAnsi="Courier New" w:cs="Courier New"/>
@@ -4992,7 +5002,6 @@
         <w:t xml:space="preserve"># </w:t>
       </w:r>
       <w:proofErr w:type="spellStart"/>
-      <w:proofErr w:type="gramStart"/>
       <w:r>
         <w:rPr>
           <w:rFonts w:cs="Courier New"/>
@@ -5002,7 +5011,6 @@
         <w:t>strandedness</w:t>
       </w:r>
       <w:proofErr w:type="spellEnd"/>
-      <w:proofErr w:type="gramEnd"/>
       <w:r>
         <w:rPr>
           <w:rFonts w:cs="Courier New"/>
@@ -5132,6 +5140,7 @@
         <w:t xml:space="preserve">) </w:t>
       </w:r>
       <w:proofErr w:type="spellStart"/>
+      <w:proofErr w:type="gramStart"/>
       <w:r>
         <w:rPr>
           <w:rFonts w:ascii="Courier New" w:hAnsi="Courier New" w:cs="Courier New"/>
@@ -5147,7 +5156,16 @@
           <w:sz w:val="20"/>
           <w:szCs w:val="20"/>
         </w:rPr>
-        <w:t xml:space="preserve">( s, N=50, </w:t>
+        <w:t>( s</w:t>
+      </w:r>
+      <w:proofErr w:type="gramEnd"/>
+      <w:r>
+        <w:rPr>
+          <w:rFonts w:ascii="Courier New" w:hAnsi="Courier New" w:cs="Courier New"/>
+          <w:sz w:val="20"/>
+          <w:szCs w:val="20"/>
+        </w:rPr>
+        <w:t xml:space="preserve">, N=50, </w:t>
       </w:r>
       <w:proofErr w:type="spellStart"/>
       <w:r>
@@ -5251,25 +5269,7 @@
           <w:sz w:val="20"/>
           <w:szCs w:val="20"/>
         </w:rPr>
-        <w:t xml:space="preserve"># </w:t>
-      </w:r>
-      <w:proofErr w:type="gramStart"/>
-      <w:r>
-        <w:rPr>
-          <w:rFonts w:cs="Courier New"/>
-          <w:sz w:val="20"/>
-          <w:szCs w:val="20"/>
-        </w:rPr>
-        <w:t>to</w:t>
-      </w:r>
-      <w:proofErr w:type="gramEnd"/>
-      <w:r>
-        <w:rPr>
-          <w:rFonts w:cs="Courier New"/>
-          <w:sz w:val="20"/>
-          <w:szCs w:val="20"/>
-        </w:rPr>
-        <w:t xml:space="preserve"> the current working directory</w:t>
+        <w:t># to the current working directory</w:t>
       </w:r>
     </w:p>
     <w:p>
@@ -5302,7 +5302,6 @@
         <w:t>xtractPipelineSummaryDetails</w:t>
       </w:r>
       <w:proofErr w:type="spellEnd"/>
-      <w:proofErr w:type="gramEnd"/>
       <w:r>
         <w:rPr>
           <w:rFonts w:ascii="Courier New" w:hAnsi="Courier New" w:cs="Courier New"/>
@@ -5321,6 +5320,7 @@
         <w:t>sids</w:t>
       </w:r>
       <w:proofErr w:type="spellEnd"/>
+      <w:proofErr w:type="gramEnd"/>
       <w:r>
         <w:rPr>
           <w:rFonts w:ascii="Courier New" w:hAnsi="Courier New" w:cs="Courier New"/>
@@ -5397,25 +5397,7 @@
           <w:sz w:val="20"/>
           <w:szCs w:val="20"/>
         </w:rPr>
-        <w:t xml:space="preserve"># </w:t>
-      </w:r>
-      <w:proofErr w:type="gramStart"/>
-      <w:r>
-        <w:rPr>
-          <w:rFonts w:cs="Courier New"/>
-          <w:sz w:val="20"/>
-          <w:szCs w:val="20"/>
-        </w:rPr>
-        <w:t>accepts</w:t>
-      </w:r>
-      <w:proofErr w:type="gramEnd"/>
-      <w:r>
-        <w:rPr>
-          <w:rFonts w:cs="Courier New"/>
-          <w:sz w:val="20"/>
-          <w:szCs w:val="20"/>
-        </w:rPr>
-        <w:t xml:space="preserve"> one or more </w:t>
+        <w:t xml:space="preserve"># accepts one or more </w:t>
       </w:r>
       <w:proofErr w:type="spellStart"/>
       <w:r>
@@ -5534,7 +5516,6 @@
         <w:t>pipe.PlotGene</w:t>
       </w:r>
       <w:proofErr w:type="spellEnd"/>
-      <w:proofErr w:type="gramEnd"/>
       <w:r>
         <w:rPr>
           <w:rFonts w:ascii="Courier New" w:hAnsi="Courier New" w:cs="Courier New"/>
@@ -5553,6 +5534,7 @@
         <w:t>sids</w:t>
       </w:r>
       <w:proofErr w:type="spellEnd"/>
+      <w:proofErr w:type="gramEnd"/>
       <w:r>
         <w:rPr>
           <w:rFonts w:ascii="Courier New" w:hAnsi="Courier New" w:cs="Courier New"/>
@@ -5584,7 +5566,6 @@
         <w:t>pipe.PlotGene</w:t>
       </w:r>
       <w:proofErr w:type="spellEnd"/>
-      <w:proofErr w:type="gramEnd"/>
       <w:r>
         <w:rPr>
           <w:rFonts w:ascii="Courier New" w:hAnsi="Courier New" w:cs="Courier New"/>
@@ -5603,6 +5584,7 @@
         <w:t>sids</w:t>
       </w:r>
       <w:proofErr w:type="spellEnd"/>
+      <w:proofErr w:type="gramEnd"/>
       <w:r>
         <w:rPr>
           <w:rFonts w:ascii="Courier New" w:hAnsi="Courier New" w:cs="Courier New"/>
@@ -5883,25 +5865,7 @@
           <w:sz w:val="20"/>
           <w:szCs w:val="20"/>
         </w:rPr>
-        <w:t xml:space="preserve"># </w:t>
-      </w:r>
-      <w:proofErr w:type="gramStart"/>
-      <w:r>
-        <w:rPr>
-          <w:rFonts w:cs="Courier New"/>
-          <w:sz w:val="20"/>
-          <w:szCs w:val="20"/>
-        </w:rPr>
-        <w:t>that</w:t>
-      </w:r>
-      <w:proofErr w:type="gramEnd"/>
-      <w:r>
-        <w:rPr>
-          <w:rFonts w:cs="Courier New"/>
-          <w:sz w:val="20"/>
-          <w:szCs w:val="20"/>
-        </w:rPr>
-        <w:t xml:space="preserve"> you can then send to cluster tools, PCA, etc.</w:t>
+        <w:t># that you can then send to cluster tools, PCA, etc.</w:t>
       </w:r>
     </w:p>
     <w:p>
@@ -5944,14 +5908,31 @@
         <w:t>file.path</w:t>
       </w:r>
       <w:proofErr w:type="spellEnd"/>
-      <w:proofErr w:type="gramEnd"/>
-      <w:r>
-        <w:rPr>
-          <w:rFonts w:ascii="Courier New" w:hAnsi="Courier New" w:cs="Courier New"/>
-          <w:sz w:val="20"/>
-          <w:szCs w:val="20"/>
-        </w:rPr>
-        <w:t>( "results/transcript/", paste(</w:t>
+      <w:r>
+        <w:rPr>
+          <w:rFonts w:ascii="Courier New" w:hAnsi="Courier New" w:cs="Courier New"/>
+          <w:sz w:val="20"/>
+          <w:szCs w:val="20"/>
+        </w:rPr>
+        <w:t>( "</w:t>
+      </w:r>
+      <w:proofErr w:type="gramEnd"/>
+      <w:r>
+        <w:rPr>
+          <w:rFonts w:ascii="Courier New" w:hAnsi="Courier New" w:cs="Courier New"/>
+          <w:sz w:val="20"/>
+          <w:szCs w:val="20"/>
+        </w:rPr>
+        <w:t xml:space="preserve">results/transcript/", </w:t>
+      </w:r>
+      <w:proofErr w:type="gramStart"/>
+      <w:r>
+        <w:rPr>
+          <w:rFonts w:ascii="Courier New" w:hAnsi="Courier New" w:cs="Courier New"/>
+          <w:sz w:val="20"/>
+          <w:szCs w:val="20"/>
+        </w:rPr>
+        <w:t>paste(</w:t>
       </w:r>
       <w:r>
         <w:rPr>
@@ -5971,6 +5952,7 @@
         <w:t>sids</w:t>
       </w:r>
       <w:proofErr w:type="spellEnd"/>
+      <w:proofErr w:type="gramEnd"/>
       <w:r>
         <w:rPr>
           <w:rFonts w:ascii="Courier New" w:hAnsi="Courier New" w:cs="Courier New"/>
@@ -6164,14 +6146,22 @@
         <w:t>expressionCluster</w:t>
       </w:r>
       <w:proofErr w:type="spellEnd"/>
-      <w:proofErr w:type="gramEnd"/>
-      <w:r>
-        <w:rPr>
-          <w:rFonts w:ascii="Courier New" w:hAnsi="Courier New" w:cs="Courier New"/>
-          <w:sz w:val="20"/>
-          <w:szCs w:val="20"/>
-        </w:rPr>
-        <w:t>( m))</w:t>
+      <w:r>
+        <w:rPr>
+          <w:rFonts w:ascii="Courier New" w:hAnsi="Courier New" w:cs="Courier New"/>
+          <w:sz w:val="20"/>
+          <w:szCs w:val="20"/>
+        </w:rPr>
+        <w:t>( m</w:t>
+      </w:r>
+      <w:proofErr w:type="gramEnd"/>
+      <w:r>
+        <w:rPr>
+          <w:rFonts w:ascii="Courier New" w:hAnsi="Courier New" w:cs="Courier New"/>
+          <w:sz w:val="20"/>
+          <w:szCs w:val="20"/>
+        </w:rPr>
+        <w:t>))</w:t>
       </w:r>
     </w:p>
     <w:p>
@@ -6236,14 +6226,22 @@
         <w:t>matrix.PCAplot</w:t>
       </w:r>
       <w:proofErr w:type="spellEnd"/>
-      <w:proofErr w:type="gramEnd"/>
-      <w:r>
-        <w:rPr>
-          <w:rFonts w:ascii="Courier New" w:hAnsi="Courier New" w:cs="Courier New"/>
-          <w:sz w:val="20"/>
-          <w:szCs w:val="20"/>
-        </w:rPr>
-        <w:t>( m, col=</w:t>
+      <w:r>
+        <w:rPr>
+          <w:rFonts w:ascii="Courier New" w:hAnsi="Courier New" w:cs="Courier New"/>
+          <w:sz w:val="20"/>
+          <w:szCs w:val="20"/>
+        </w:rPr>
+        <w:t>( m</w:t>
+      </w:r>
+      <w:proofErr w:type="gramEnd"/>
+      <w:r>
+        <w:rPr>
+          <w:rFonts w:ascii="Courier New" w:hAnsi="Courier New" w:cs="Courier New"/>
+          <w:sz w:val="20"/>
+          <w:szCs w:val="20"/>
+        </w:rPr>
+        <w:t>, col=</w:t>
       </w:r>
       <w:proofErr w:type="spellStart"/>
       <w:r>
@@ -6494,7 +6492,23 @@
           <w:rFonts w:cs="Courier New"/>
           <w:szCs w:val="20"/>
         </w:rPr>
-        <w:t xml:space="preserve">version 1.8.0, the Ratio files are no longer needed.  Default Round Robin behavior is to start directly from the transcriptomes and make ratio information dynamically.  So the above step can be ignored, </w:t>
+        <w:t xml:space="preserve">version 1.8.0, the Ratio files are no longer needed.  Default Round Robin behavior is to start directly from the transcriptomes and make ratio information dynamically.  </w:t>
+      </w:r>
+      <w:proofErr w:type="gramStart"/>
+      <w:r>
+        <w:rPr>
+          <w:rFonts w:cs="Courier New"/>
+          <w:szCs w:val="20"/>
+        </w:rPr>
+        <w:t>So</w:t>
+      </w:r>
+      <w:proofErr w:type="gramEnd"/>
+      <w:r>
+        <w:rPr>
+          <w:rFonts w:cs="Courier New"/>
+          <w:szCs w:val="20"/>
+        </w:rPr>
+        <w:t xml:space="preserve"> the above step can be ignored, </w:t>
       </w:r>
       <w:proofErr w:type="spellStart"/>
       <w:proofErr w:type="gramStart"/>
@@ -6623,25 +6637,7 @@
           <w:sz w:val="20"/>
           <w:szCs w:val="20"/>
         </w:rPr>
-        <w:t xml:space="preserve"># </w:t>
-      </w:r>
-      <w:proofErr w:type="gramStart"/>
-      <w:r>
-        <w:rPr>
-          <w:rFonts w:cs="Courier New"/>
-          <w:sz w:val="20"/>
-          <w:szCs w:val="20"/>
-        </w:rPr>
-        <w:t>creates</w:t>
-      </w:r>
-      <w:proofErr w:type="gramEnd"/>
-      <w:r>
-        <w:rPr>
-          <w:rFonts w:cs="Courier New"/>
-          <w:sz w:val="20"/>
-          <w:szCs w:val="20"/>
-        </w:rPr>
-        <w:t xml:space="preserve"> 5 DE folders of results from each of the 5 DE tools, </w:t>
+        <w:t xml:space="preserve"># creates 5 DE folders of results from each of the 5 DE tools, </w:t>
       </w:r>
     </w:p>
     <w:p>
@@ -6661,25 +6657,7 @@
           <w:sz w:val="20"/>
           <w:szCs w:val="20"/>
         </w:rPr>
-        <w:t xml:space="preserve"># </w:t>
-      </w:r>
-      <w:proofErr w:type="gramStart"/>
-      <w:r>
-        <w:rPr>
-          <w:rFonts w:cs="Courier New"/>
-          <w:sz w:val="20"/>
-          <w:szCs w:val="20"/>
-        </w:rPr>
-        <w:t>and</w:t>
-      </w:r>
-      <w:proofErr w:type="gramEnd"/>
-      <w:r>
-        <w:rPr>
-          <w:rFonts w:cs="Courier New"/>
-          <w:sz w:val="20"/>
-          <w:szCs w:val="20"/>
-        </w:rPr>
-        <w:t xml:space="preserve"> then merges those into one “</w:t>
+        <w:t># and then merges those into one “</w:t>
       </w:r>
       <w:proofErr w:type="spellStart"/>
       <w:r>
@@ -6778,7 +6756,6 @@
         <w:t>pipe.MetaResults</w:t>
       </w:r>
       <w:proofErr w:type="spellEnd"/>
-      <w:proofErr w:type="gramEnd"/>
       <w:r>
         <w:rPr>
           <w:rFonts w:ascii="Courier New" w:hAnsi="Courier New" w:cs="Courier New"/>
@@ -6797,6 +6774,7 @@
         <w:t>sids</w:t>
       </w:r>
       <w:proofErr w:type="spellEnd"/>
+      <w:proofErr w:type="gramEnd"/>
       <w:r>
         <w:rPr>
           <w:rFonts w:ascii="Courier New" w:hAnsi="Courier New" w:cs="Courier New"/>
@@ -6806,6 +6784,7 @@
         <w:t>, folder="</w:t>
       </w:r>
       <w:proofErr w:type="spellStart"/>
+      <w:proofErr w:type="gramStart"/>
       <w:r>
         <w:rPr>
           <w:rFonts w:ascii="Courier New" w:hAnsi="Courier New" w:cs="Courier New"/>
@@ -6823,6 +6802,7 @@
         <w:t>.v.Uninduced</w:t>
       </w:r>
       <w:proofErr w:type="spellEnd"/>
+      <w:proofErr w:type="gramEnd"/>
       <w:r>
         <w:rPr>
           <w:rFonts w:ascii="Courier New" w:hAnsi="Courier New" w:cs="Courier New"/>
@@ -7102,25 +7082,7 @@
           <w:sz w:val="20"/>
           <w:szCs w:val="20"/>
         </w:rPr>
-        <w:t xml:space="preserve"># </w:t>
-      </w:r>
-      <w:proofErr w:type="gramStart"/>
-      <w:r>
-        <w:rPr>
-          <w:rFonts w:cs="Courier New"/>
-          <w:sz w:val="20"/>
-          <w:szCs w:val="20"/>
-        </w:rPr>
-        <w:t>creates</w:t>
-      </w:r>
-      <w:proofErr w:type="gramEnd"/>
-      <w:r>
-        <w:rPr>
-          <w:rFonts w:cs="Courier New"/>
-          <w:sz w:val="20"/>
-          <w:szCs w:val="20"/>
-        </w:rPr>
-        <w:t xml:space="preserve"> 4 </w:t>
+        <w:t xml:space="preserve"># creates 4 </w:t>
       </w:r>
       <w:proofErr w:type="spellStart"/>
       <w:r>
@@ -7158,43 +7120,7 @@
           <w:sz w:val="20"/>
           <w:szCs w:val="20"/>
         </w:rPr>
-        <w:t xml:space="preserve"># </w:t>
-      </w:r>
-      <w:proofErr w:type="gramStart"/>
-      <w:r>
-        <w:rPr>
-          <w:rFonts w:cs="Courier New"/>
-          <w:sz w:val="20"/>
-          <w:szCs w:val="20"/>
-        </w:rPr>
-        <w:t>results</w:t>
-      </w:r>
-      <w:proofErr w:type="gramEnd"/>
-      <w:r>
-        <w:rPr>
-          <w:rFonts w:cs="Courier New"/>
-          <w:sz w:val="20"/>
-          <w:szCs w:val="20"/>
-        </w:rPr>
-        <w:t xml:space="preserve"> into one “</w:t>
-      </w:r>
-      <w:proofErr w:type="spellStart"/>
-      <w:r>
-        <w:rPr>
-          <w:rFonts w:cs="Courier New"/>
-          <w:sz w:val="20"/>
-          <w:szCs w:val="20"/>
-        </w:rPr>
-        <w:t>MetaGeneSets</w:t>
-      </w:r>
-      <w:proofErr w:type="spellEnd"/>
-      <w:r>
-        <w:rPr>
-          <w:rFonts w:cs="Courier New"/>
-          <w:sz w:val="20"/>
-          <w:szCs w:val="20"/>
-        </w:rPr>
-        <w:t>” folder.</w:t>
+        <w:t># results into one “MetaGeneSets” folder.</w:t>
       </w:r>
     </w:p>
     <w:p>
@@ -7219,7 +7145,6 @@
         <w:t>pipe.MetaGeneSets</w:t>
       </w:r>
       <w:proofErr w:type="spellEnd"/>
-      <w:proofErr w:type="gramEnd"/>
       <w:r>
         <w:rPr>
           <w:rFonts w:ascii="Courier New" w:hAnsi="Courier New" w:cs="Courier New"/>
@@ -7238,6 +7163,7 @@
         <w:t>sids</w:t>
       </w:r>
       <w:proofErr w:type="spellEnd"/>
+      <w:proofErr w:type="gramEnd"/>
       <w:r>
         <w:rPr>
           <w:rFonts w:ascii="Courier New" w:hAnsi="Courier New" w:cs="Courier New"/>
@@ -7247,6 +7173,7 @@
         <w:t>, folder="</w:t>
       </w:r>
       <w:proofErr w:type="spellStart"/>
+      <w:proofErr w:type="gramStart"/>
       <w:r>
         <w:rPr>
           <w:rFonts w:ascii="Courier New" w:hAnsi="Courier New" w:cs="Courier New"/>
@@ -7264,6 +7191,7 @@
         <w:t>.v.Uninduced</w:t>
       </w:r>
       <w:proofErr w:type="spellEnd"/>
+      <w:proofErr w:type="gramEnd"/>
       <w:r>
         <w:rPr>
           <w:rFonts w:ascii="Courier New" w:hAnsi="Courier New" w:cs="Courier New"/>
@@ -7478,25 +7406,7 @@
           <w:sz w:val="20"/>
           <w:szCs w:val="20"/>
         </w:rPr>
-        <w:t xml:space="preserve"># </w:t>
-      </w:r>
-      <w:proofErr w:type="gramStart"/>
-      <w:r>
-        <w:rPr>
-          <w:rFonts w:cs="Courier New"/>
-          <w:sz w:val="20"/>
-          <w:szCs w:val="20"/>
-        </w:rPr>
-        <w:t>done</w:t>
-      </w:r>
-      <w:proofErr w:type="gramEnd"/>
-      <w:r>
-        <w:rPr>
-          <w:rFonts w:cs="Courier New"/>
-          <w:sz w:val="20"/>
-          <w:szCs w:val="20"/>
-        </w:rPr>
-        <w:t xml:space="preserve"> for now</w:t>
+        <w:t># done for now</w:t>
       </w:r>
     </w:p>
     <w:p>
@@ -7730,15 +7640,7 @@
         </w:rPr>
       </w:pPr>
       <w:r>
-        <w:t>If the gene annotation changes (</w:t>
-      </w:r>
-      <w:proofErr w:type="gramStart"/>
-      <w:r>
-        <w:t>i.e.</w:t>
-      </w:r>
-      <w:proofErr w:type="gramEnd"/>
-      <w:r>
-        <w:t xml:space="preserve"> the ‘</w:t>
+        <w:t>If the gene annotation changes (i.e. the ‘</w:t>
       </w:r>
       <w:proofErr w:type="spellStart"/>
       <w:r>
@@ -7795,6 +7697,7 @@
         <w:t>’ and/or ‘</w:t>
       </w:r>
       <w:proofErr w:type="spellStart"/>
+      <w:proofErr w:type="gramStart"/>
       <w:r>
         <w:rPr>
           <w:rFonts w:ascii="Courier New" w:hAnsi="Courier New" w:cs="Courier New"/>
@@ -7803,6 +7706,7 @@
         <w:t>pipe.Transcriptome</w:t>
       </w:r>
       <w:proofErr w:type="spellEnd"/>
+      <w:proofErr w:type="gramEnd"/>
       <w:r>
         <w:rPr>
           <w:rFonts w:ascii="Courier New" w:hAnsi="Courier New" w:cs="Courier New"/>
@@ -8482,16 +8386,11 @@
       <w:r>
         <w:t>If ribosomal clearing of unwanted transcripts was performed, (see option “</w:t>
       </w:r>
-      <w:proofErr w:type="spellStart"/>
       <w:r>
         <w:t>Ribo</w:t>
       </w:r>
       <w:r>
-        <w:t>Index</w:t>
-      </w:r>
-      <w:proofErr w:type="spellEnd"/>
-      <w:r>
-        <w:t xml:space="preserve">”), this folder contains the alignment BAM files for reads that successfully aligned to those genes slated for clearing.  The list of genes flagged for clearing is hardcoded into the annotation </w:t>
+        <w:t xml:space="preserve">Index”), this folder contains the alignment BAM files for reads that successfully aligned to those genes slated for clearing.  The list of genes flagged for clearing is hardcoded into the annotation </w:t>
       </w:r>
       <w:proofErr w:type="spellStart"/>
       <w:r>
@@ -8510,10 +8409,18 @@
       </w:r>
       <w:proofErr w:type="gramEnd"/>
       <w:r>
-        <w:t xml:space="preserve"> is not user-adjust</w:t>
-      </w:r>
-      <w:r>
-        <w:t>able.</w:t>
+        <w:t xml:space="preserve"> is not </w:t>
+      </w:r>
+      <w:proofErr w:type="gramStart"/>
+      <w:r>
+        <w:t>user-adjust</w:t>
+      </w:r>
+      <w:r>
+        <w:t>able</w:t>
+      </w:r>
+      <w:proofErr w:type="gramEnd"/>
+      <w:r>
+        <w:t>.</w:t>
       </w:r>
     </w:p>
     <w:p>
@@ -9038,8 +8945,13 @@
         </w:rPr>
         <w:t>()</w:t>
       </w:r>
-      <w:r>
-        <w:t>”, and are typically used to assess pipeline runtime annotation settings like “</w:t>
+      <w:proofErr w:type="gramStart"/>
+      <w:r>
+        <w:t>”, and</w:t>
+      </w:r>
+      <w:proofErr w:type="gramEnd"/>
+      <w:r>
+        <w:t xml:space="preserve"> are typically used to assess pipeline runtime annotation settings like “</w:t>
       </w:r>
       <w:proofErr w:type="spellStart"/>
       <w:r>
@@ -9094,7 +9006,15 @@
       </w:r>
       <w:proofErr w:type="spellEnd"/>
       <w:r>
-        <w:t>” will generate 2 ratio files from each sample pair.  These files are generated by the low level differential expression tool “</w:t>
+        <w:t xml:space="preserve">” will generate 2 ratio files from each sample pair.  These files are generated by the </w:t>
+      </w:r>
+      <w:proofErr w:type="gramStart"/>
+      <w:r>
+        <w:t>low level</w:t>
+      </w:r>
+      <w:proofErr w:type="gramEnd"/>
+      <w:r>
+        <w:t xml:space="preserve"> differential expression tool “</w:t>
       </w:r>
       <w:proofErr w:type="spellStart"/>
       <w:proofErr w:type="gramStart"/>
@@ -9104,10 +9024,18 @@
       <w:proofErr w:type="spellEnd"/>
       <w:proofErr w:type="gramEnd"/>
       <w:r>
-        <w:t>()”</w:t>
-      </w:r>
-      <w:r>
-        <w:t xml:space="preserve">;  and these files are required by </w:t>
+        <w:t>()</w:t>
+      </w:r>
+      <w:proofErr w:type="gramStart"/>
+      <w:r>
+        <w:t>”</w:t>
+      </w:r>
+      <w:r>
+        <w:t>;  and</w:t>
+      </w:r>
+      <w:proofErr w:type="gramEnd"/>
+      <w:r>
+        <w:t xml:space="preserve"> these files are required by </w:t>
       </w:r>
       <w:proofErr w:type="spellStart"/>
       <w:r>
@@ -9115,7 +9043,15 @@
       </w:r>
       <w:proofErr w:type="spellEnd"/>
       <w:r>
-        <w:t>, one of the high level differential expression tools described below.</w:t>
+        <w:t xml:space="preserve">, one of the </w:t>
+      </w:r>
+      <w:proofErr w:type="gramStart"/>
+      <w:r>
+        <w:t>high level</w:t>
+      </w:r>
+      <w:proofErr w:type="gramEnd"/>
+      <w:r>
+        <w:t xml:space="preserve"> differential expression tools described below.</w:t>
       </w:r>
       <w:r>
         <w:t xml:space="preserve">  As of version 1.8.0, the subfolder of ratio files is no longer needed.</w:t>
@@ -9228,10 +9164,18 @@
       </w:r>
       <w:proofErr w:type="gramEnd"/>
       <w:r>
-        <w:t>2html</w:t>
-      </w:r>
-      <w:r>
-        <w:t>()”</w:t>
+        <w:t>2</w:t>
+      </w:r>
+      <w:proofErr w:type="gramStart"/>
+      <w:r>
+        <w:t>html</w:t>
+      </w:r>
+      <w:r>
+        <w:t>(</w:t>
+      </w:r>
+      <w:proofErr w:type="gramEnd"/>
+      <w:r>
+        <w:t>)”</w:t>
       </w:r>
       <w:r>
         <w:t xml:space="preserve"> can be run subsequently to make a HTML file and subfolder of SNP plot images for the highest scoring SNPs.</w:t>
@@ -9375,13 +9319,8 @@
         <w:t>Each tool has its own methodology</w:t>
       </w:r>
       <w:r>
-        <w:t xml:space="preserve">, </w:t>
-      </w:r>
-      <w:proofErr w:type="gramStart"/>
-      <w:r>
-        <w:t>input</w:t>
-      </w:r>
-      <w:proofErr w:type="gramEnd"/>
+        <w:t>, input</w:t>
+      </w:r>
       <w:r>
         <w:t xml:space="preserve"> and output details, </w:t>
       </w:r>
@@ -9487,7 +9426,15 @@
       </w:r>
       <w:proofErr w:type="gramEnd"/>
       <w:r>
-        <w:t>Transcripts Per Million” (TPM) (Wagner 2012), in addition to the default units of “Reads Per K(thousand exon bases) per Million aligned reads (RPKM).   The default for all DE tools is RPKM, but choice of units can be controlled with option “</w:t>
+        <w:t xml:space="preserve">Transcripts Per Million” (TPM) (Wagner 2012), in addition to the default units of “Reads Per </w:t>
+      </w:r>
+      <w:proofErr w:type="gramStart"/>
+      <w:r>
+        <w:t>K(</w:t>
+      </w:r>
+      <w:proofErr w:type="gramEnd"/>
+      <w:r>
+        <w:t>thousand exon bases) per Million aligned reads (RPKM).   The default for all DE tools is RPKM, but choice of units can be controlled with option “</w:t>
       </w:r>
       <w:proofErr w:type="spellStart"/>
       <w:proofErr w:type="gramStart"/>
@@ -10128,11 +10075,19 @@
           <w:rFonts w:cstheme="minorHAnsi"/>
           <w:b/>
         </w:rPr>
-        <w:t xml:space="preserve"> Biology</w:t>
-      </w:r>
+        <w:t xml:space="preserve"> </w:t>
+      </w:r>
+      <w:proofErr w:type="gramStart"/>
       <w:r>
         <w:rPr>
           <w:rFonts w:cstheme="minorHAnsi"/>
+          <w:b/>
+        </w:rPr>
+        <w:t>Biology</w:t>
+      </w:r>
+      <w:r>
+        <w:rPr>
+          <w:rFonts w:cstheme="minorHAnsi"/>
         </w:rPr>
         <w:t xml:space="preserve"> </w:t>
       </w:r>
@@ -10140,21 +10095,20 @@
         <w:rPr>
           <w:rFonts w:cstheme="minorHAnsi"/>
         </w:rPr>
-        <w:t xml:space="preserve"> (2010</w:t>
+        <w:t xml:space="preserve"> (</w:t>
+      </w:r>
+      <w:proofErr w:type="gramEnd"/>
+      <w:r>
+        <w:rPr>
+          <w:rFonts w:cstheme="minorHAnsi"/>
+        </w:rPr>
+        <w:t>2010</w:t>
       </w:r>
       <w:r>
         <w:t>).</w:t>
       </w:r>
       <w:r>
-        <w:t xml:space="preserve">  (</w:t>
-      </w:r>
-      <w:proofErr w:type="gramStart"/>
-      <w:r>
-        <w:t>the</w:t>
-      </w:r>
-      <w:proofErr w:type="gramEnd"/>
-      <w:r>
-        <w:t xml:space="preserve"> newer DESeq2 does not correctly support groups with only a single sam</w:t>
+        <w:t xml:space="preserve">  (the newer DESeq2 does not correctly support groups with only a single sam</w:t>
       </w:r>
       <w:r>
         <w:t xml:space="preserve">ple, so original </w:t>
@@ -10340,26 +10294,10 @@
         <w:t xml:space="preserve">precisely </w:t>
       </w:r>
       <w:r>
-        <w:t>specify the file contents:   1</w:t>
-      </w:r>
-      <w:proofErr w:type="gramStart"/>
-      <w:r>
-        <w:t>)  the</w:t>
-      </w:r>
-      <w:proofErr w:type="gramEnd"/>
-      <w:r>
-        <w:t xml:space="preserve"> comparison group;  2) the species prefix;  3)  the DE tool abbreviation;  4)  the DE directional suffix (typically one of “UP” or “DOWN”); and lastly  5)  the file type suffix, as in HTML, CSV, TXT, etc.</w:t>
-      </w:r>
-      <w:r>
-        <w:t xml:space="preserve">  </w:t>
-      </w:r>
-      <w:proofErr w:type="gramStart"/>
-      <w:r>
-        <w:t>Depending on the DE tool, there</w:t>
-      </w:r>
-      <w:proofErr w:type="gramEnd"/>
-      <w:r>
-        <w:t xml:space="preserve"> will be 2-6 separate files for each comparison group.</w:t>
+        <w:t>specify the file contents:   1)  the comparison group;  2) the species prefix;  3)  the DE tool abbreviation;  4)  the DE directional suffix (typically one of “UP” or “DOWN”); and lastly  5)  the file type suffix, as in HTML, CSV, TXT, etc.</w:t>
+      </w:r>
+      <w:r>
+        <w:t xml:space="preserve">  Depending on the DE tool, there will be 2-6 separate files for each comparison group.</w:t>
       </w:r>
     </w:p>
     <w:p>
@@ -10372,15 +10310,7 @@
         <w:pStyle w:val="ListParagraph"/>
       </w:pPr>
       <w:r>
-        <w:t>In the general case, each comparison group is being evaluated against all other comparison groups at the exact same time, in what can be thought of as a K-way comparison.  In the trivial case of a 2-group comparison, there will be symmetric results (</w:t>
-      </w:r>
-      <w:proofErr w:type="gramStart"/>
-      <w:r>
-        <w:t>e.g.</w:t>
-      </w:r>
-      <w:proofErr w:type="gramEnd"/>
-      <w:r>
-        <w:t xml:space="preserve"> </w:t>
+        <w:t xml:space="preserve">In the general case, each comparison group is being evaluated against all other comparison groups at the exact same time, in what can be thought of as a K-way comparison.  In the trivial case of a 2-group comparison, there will be symmetric results (e.g. </w:t>
       </w:r>
       <w:r>
         <w:t>“</w:t>
@@ -10427,7 +10357,15 @@
       </w:r>
       <w:proofErr w:type="gramEnd"/>
       <w:r>
-        <w:t xml:space="preserve">UP.txt”,  “DOWN.txt” and/or “Ratio.txt”:   these text files contain all the genes in the genome, sorted by up or down regulation.  Each file contains all columns of DE details as generated by the specific DE tool.  </w:t>
+        <w:t>UP.txt</w:t>
+      </w:r>
+      <w:proofErr w:type="gramStart"/>
+      <w:r>
+        <w:t>”,  “</w:t>
+      </w:r>
+      <w:proofErr w:type="gramEnd"/>
+      <w:r>
+        <w:t xml:space="preserve">DOWN.txt” and/or “Ratio.txt”:   these text files contain all the genes in the genome, sorted by up or down regulation.  Each file contains all columns of DE details as generated by the specific DE tool.  </w:t>
       </w:r>
       <w:proofErr w:type="gramStart"/>
       <w:r>
@@ -10454,7 +10392,15 @@
       </w:r>
       <w:proofErr w:type="gramEnd"/>
       <w:r>
-        <w:t>UP.html”,  “DOWN.html”:   these hypertext files contain just the top N most DE genes (N usually 100-200 or so), with hyperlinks to some form of gene expression plot images.  These file</w:t>
+        <w:t>UP.html</w:t>
+      </w:r>
+      <w:proofErr w:type="gramStart"/>
+      <w:r>
+        <w:t>”,  “</w:t>
+      </w:r>
+      <w:proofErr w:type="gramEnd"/>
+      <w:r>
+        <w:t>DOWN.html”:   these hypertext files contain just the top N most DE genes (N usually 100-200 or so), with hyperlinks to some form of gene expression plot images.  These file</w:t>
       </w:r>
       <w:r>
         <w:t>s</w:t>
@@ -10511,15 +10457,15 @@
         <w:t xml:space="preserve"> only) are supplemental results that convey information about cell type enrichment (or parasite life cycle in the case of parasite genomes).</w:t>
       </w:r>
       <w:r>
-        <w:t xml:space="preserve">  Taking the genes </w:t>
-      </w:r>
-      <w:proofErr w:type="gramStart"/>
-      <w:r>
-        <w:t>called significantly</w:t>
-      </w:r>
-      <w:proofErr w:type="gramEnd"/>
-      <w:r>
-        <w:t xml:space="preserve"> DE, and looking at their associated cell types, these files suggest if the comparison group as a whole is over or under enriched for any specific cell types.</w:t>
+        <w:t xml:space="preserve">  Taking the genes called significantly DE, and looking at their associated cell types, these files suggest if the comparison group </w:t>
+      </w:r>
+      <w:proofErr w:type="gramStart"/>
+      <w:r>
+        <w:t>as a whole is</w:t>
+      </w:r>
+      <w:proofErr w:type="gramEnd"/>
+      <w:r>
+        <w:t xml:space="preserve"> over or under enriched for any specific cell types.</w:t>
       </w:r>
     </w:p>
     <w:p>
@@ -10636,7 +10582,6 @@
         <w:t>pipe.MetaResults</w:t>
       </w:r>
       <w:proofErr w:type="spellEnd"/>
-      <w:proofErr w:type="gramEnd"/>
       <w:r>
         <w:rPr>
           <w:rFonts w:ascii="Courier New" w:hAnsi="Courier New" w:cs="Courier New"/>
@@ -10660,6 +10605,7 @@
         <w:t>et</w:t>
       </w:r>
       <w:proofErr w:type="spellEnd"/>
+      <w:proofErr w:type="gramEnd"/>
       <w:r>
         <w:rPr>
           <w:rFonts w:ascii="Courier New" w:hAnsi="Courier New" w:cs="Courier New"/>
@@ -10692,12 +10638,21 @@
         <w:t>groupColumn</w:t>
       </w:r>
       <w:proofErr w:type="spellEnd"/>
-      <w:r>
-        <w:rPr>
-          <w:rFonts w:ascii="Courier New" w:hAnsi="Courier New" w:cs="Courier New"/>
-          <w:sz w:val="20"/>
-        </w:rPr>
-        <w:t>=”Group”,</w:t>
+      <w:proofErr w:type="gramStart"/>
+      <w:r>
+        <w:rPr>
+          <w:rFonts w:ascii="Courier New" w:hAnsi="Courier New" w:cs="Courier New"/>
+          <w:sz w:val="20"/>
+        </w:rPr>
+        <w:t>=”Group</w:t>
+      </w:r>
+      <w:proofErr w:type="gramEnd"/>
+      <w:r>
+        <w:rPr>
+          <w:rFonts w:ascii="Courier New" w:hAnsi="Courier New" w:cs="Courier New"/>
+          <w:sz w:val="20"/>
+        </w:rPr>
+        <w:t>”,</w:t>
       </w:r>
     </w:p>
     <w:p>
@@ -10750,6 +10705,7 @@
         <w:t>=</w:t>
       </w:r>
       <w:proofErr w:type="spellStart"/>
+      <w:proofErr w:type="gramStart"/>
       <w:r>
         <w:rPr>
           <w:rFonts w:ascii="Courier New" w:hAnsi="Courier New" w:cs="Courier New"/>
@@ -10763,7 +10719,15 @@
           <w:rFonts w:ascii="Courier New" w:hAnsi="Courier New" w:cs="Courier New"/>
           <w:sz w:val="20"/>
         </w:rPr>
-        <w:t>(),</w:t>
+        <w:t>(</w:t>
+      </w:r>
+      <w:proofErr w:type="gramEnd"/>
+      <w:r>
+        <w:rPr>
+          <w:rFonts w:ascii="Courier New" w:hAnsi="Courier New" w:cs="Courier New"/>
+          <w:sz w:val="20"/>
+        </w:rPr>
+        <w:t>),</w:t>
       </w:r>
     </w:p>
     <w:p>
@@ -10801,12 +10765,21 @@
         <w:t>annotationFile</w:t>
       </w:r>
       <w:proofErr w:type="spellEnd"/>
-      <w:r>
-        <w:rPr>
-          <w:rFonts w:ascii="Courier New" w:hAnsi="Courier New" w:cs="Courier New"/>
-          <w:sz w:val="20"/>
-        </w:rPr>
-        <w:t>=”Annotation.txt”,</w:t>
+      <w:proofErr w:type="gramStart"/>
+      <w:r>
+        <w:rPr>
+          <w:rFonts w:ascii="Courier New" w:hAnsi="Courier New" w:cs="Courier New"/>
+          <w:sz w:val="20"/>
+        </w:rPr>
+        <w:t>=”Annotation.txt</w:t>
+      </w:r>
+      <w:proofErr w:type="gramEnd"/>
+      <w:r>
+        <w:rPr>
+          <w:rFonts w:ascii="Courier New" w:hAnsi="Courier New" w:cs="Courier New"/>
+          <w:sz w:val="20"/>
+        </w:rPr>
+        <w:t>”,</w:t>
       </w:r>
     </w:p>
     <w:p>
@@ -10832,15 +10805,7 @@
           <w:rFonts w:ascii="Courier New" w:hAnsi="Courier New" w:cs="Courier New"/>
           <w:sz w:val="20"/>
         </w:rPr>
-        <w:t>=”Options.txt</w:t>
-      </w:r>
-      <w:proofErr w:type="gramEnd"/>
-      <w:r>
-        <w:rPr>
-          <w:rFonts w:ascii="Courier New" w:hAnsi="Courier New" w:cs="Courier New"/>
-          <w:sz w:val="20"/>
-        </w:rPr>
-        <w:t>”,</w:t>
+        <w:t>=”Options.txt”,</w:t>
       </w:r>
       <w:proofErr w:type="spellStart"/>
       <w:r>
@@ -10851,6 +10816,7 @@
         <w:t>doDE</w:t>
       </w:r>
       <w:proofErr w:type="spellEnd"/>
+      <w:proofErr w:type="gramEnd"/>
       <w:r>
         <w:rPr>
           <w:rFonts w:ascii="Courier New" w:hAnsi="Courier New" w:cs="Courier New"/>
@@ -10905,34 +10871,45 @@
         <w:t>()”, “</w:t>
       </w:r>
       <w:proofErr w:type="spellStart"/>
+      <w:proofErr w:type="gramStart"/>
       <w:r>
         <w:t>pipe.RankProduct</w:t>
       </w:r>
       <w:proofErr w:type="spellEnd"/>
+      <w:proofErr w:type="gramEnd"/>
       <w:r>
         <w:t>()”, “</w:t>
       </w:r>
       <w:proofErr w:type="spellStart"/>
+      <w:proofErr w:type="gramStart"/>
       <w:r>
         <w:t>pipe.SAM</w:t>
       </w:r>
       <w:proofErr w:type="spellEnd"/>
       <w:r>
-        <w:t>()”, “</w:t>
-      </w:r>
-      <w:proofErr w:type="spellStart"/>
+        <w:t>(</w:t>
+      </w:r>
+      <w:proofErr w:type="gramEnd"/>
+      <w:r>
+        <w:t>)”, “</w:t>
+      </w:r>
+      <w:proofErr w:type="spellStart"/>
+      <w:proofErr w:type="gramStart"/>
       <w:r>
         <w:t>pipe.EdgeR</w:t>
       </w:r>
       <w:proofErr w:type="spellEnd"/>
+      <w:proofErr w:type="gramEnd"/>
       <w:r>
         <w:t>()”, or “</w:t>
       </w:r>
       <w:proofErr w:type="spellStart"/>
+      <w:proofErr w:type="gramStart"/>
       <w:r>
         <w:t>pipe.DESeq</w:t>
       </w:r>
       <w:proofErr w:type="spellEnd"/>
+      <w:proofErr w:type="gramEnd"/>
       <w:r>
         <w:t>()”.</w:t>
       </w:r>
@@ -11125,7 +11102,15 @@
         <w:t xml:space="preserve"> (default=NULL)</w:t>
       </w:r>
       <w:r>
-        <w:t xml:space="preserve"> -- the name of the top level results folder that contains all data to be used (transcriptomes, etc.) and all result files that will be created.  The default value means to use the value of the “</w:t>
+        <w:t xml:space="preserve"> -- the name of the </w:t>
+      </w:r>
+      <w:proofErr w:type="gramStart"/>
+      <w:r>
+        <w:t>top level</w:t>
+      </w:r>
+      <w:proofErr w:type="gramEnd"/>
+      <w:r>
+        <w:t xml:space="preserve"> results folder that contains all data to be used (transcriptomes, etc.) and all result files that will be created.  The default value means to use the value of the “</w:t>
       </w:r>
       <w:proofErr w:type="spellStart"/>
       <w:proofErr w:type="gramStart"/>
@@ -11135,7 +11120,15 @@
       <w:proofErr w:type="spellEnd"/>
       <w:proofErr w:type="gramEnd"/>
       <w:r>
-        <w:t>” option  in the “Options.txt” file.</w:t>
+        <w:t xml:space="preserve">” </w:t>
+      </w:r>
+      <w:proofErr w:type="gramStart"/>
+      <w:r>
+        <w:t>option  in</w:t>
+      </w:r>
+      <w:proofErr w:type="gramEnd"/>
+      <w:r>
+        <w:t xml:space="preserve"> the “Options.txt” file.</w:t>
       </w:r>
     </w:p>
     <w:p>
@@ -11157,7 +11150,15 @@
         <w:t xml:space="preserve"> (default=TRUE)</w:t>
       </w:r>
       <w:r>
-        <w:t xml:space="preserve"> -- should all the low level differential expression calculations be </w:t>
+        <w:t xml:space="preserve"> -- should all the </w:t>
+      </w:r>
+      <w:proofErr w:type="gramStart"/>
+      <w:r>
+        <w:t>low level</w:t>
+      </w:r>
+      <w:proofErr w:type="gramEnd"/>
+      <w:r>
+        <w:t xml:space="preserve"> differential expression calculations be </w:t>
       </w:r>
       <w:proofErr w:type="gramStart"/>
       <w:r>
@@ -11409,15 +11410,7 @@
         <w:t>.</w:t>
       </w:r>
       <w:r>
-        <w:t xml:space="preserve">  </w:t>
-      </w:r>
-      <w:proofErr w:type="gramStart"/>
-      <w:r>
-        <w:t>Each</w:t>
-      </w:r>
-      <w:proofErr w:type="gramEnd"/>
-      <w:r>
-        <w:t xml:space="preserve"> tool </w:t>
+        <w:t xml:space="preserve">  Each tool </w:t>
       </w:r>
       <w:r>
         <w:t xml:space="preserve">starts from the DE results in the current folder and evaluates a large set of pre-defined gene sets from various public sources, to find those with the best overlap and significance among the genes called DE in this comparison.  Each tool </w:t>
@@ -11502,7 +11495,15 @@
         <w:t>:</w:t>
       </w:r>
       <w:r>
-        <w:t xml:space="preserve">  uses all the differential expression results, and looks at how sets of genes behave as a collection of mass points between the different comparison groups.   When most all the genes in a network/pathway are strongly up/down regulated, their ‘mass’ shifts relative to the other comparison groups.  We can put a P-value on how unlikely such a distribution shift is.</w:t>
+        <w:t xml:space="preserve">  uses all the differential expression </w:t>
+      </w:r>
+      <w:proofErr w:type="gramStart"/>
+      <w:r>
+        <w:t>results, and</w:t>
+      </w:r>
+      <w:proofErr w:type="gramEnd"/>
+      <w:r>
+        <w:t xml:space="preserve"> looks at how sets of genes behave as a collection of mass points between the different comparison groups.   When most all the genes in a network/pathway are strongly up/down regulated, their ‘mass’ shifts relative to the other comparison groups.  We can put a P-value on how unlikely such a distribution shift is.</w:t>
       </w:r>
       <w:r>
         <w:t xml:space="preserve">  As the calculations are implemented via density functions on each group, this analysis is sometimes referred to as Gene Set Density analysis.</w:t>
@@ -11708,7 +11709,15 @@
         <w:t>:</w:t>
       </w:r>
       <w:r>
-        <w:t xml:space="preserve">   starts from the DE results, and look</w:t>
+        <w:t xml:space="preserve">   starts from the DE </w:t>
+      </w:r>
+      <w:proofErr w:type="gramStart"/>
+      <w:r>
+        <w:t>results, and</w:t>
+      </w:r>
+      <w:proofErr w:type="gramEnd"/>
+      <w:r>
+        <w:t xml:space="preserve"> look</w:t>
       </w:r>
       <w:r>
         <w:t>s at</w:t>
@@ -11766,14 +11775,12 @@
         </w:rPr>
         <w:t xml:space="preserve">  </w:t>
       </w:r>
-      <w:proofErr w:type="spellStart"/>
       <w:r>
         <w:rPr>
           <w:b/>
         </w:rPr>
         <w:t>MetaGeneSets</w:t>
       </w:r>
-      <w:proofErr w:type="spellEnd"/>
       <w:proofErr w:type="gramEnd"/>
       <w:r>
         <w:rPr>
@@ -11880,7 +11887,6 @@
         <w:t>pipe.MetaGeneSets</w:t>
       </w:r>
       <w:proofErr w:type="spellEnd"/>
-      <w:proofErr w:type="gramEnd"/>
       <w:r>
         <w:rPr>
           <w:rFonts w:ascii="Courier New" w:hAnsi="Courier New" w:cs="Courier New"/>
@@ -11904,6 +11910,7 @@
         <w:t>et</w:t>
       </w:r>
       <w:proofErr w:type="spellEnd"/>
+      <w:proofErr w:type="gramEnd"/>
       <w:r>
         <w:rPr>
           <w:rFonts w:ascii="Courier New" w:hAnsi="Courier New" w:cs="Courier New"/>
@@ -11936,12 +11943,21 @@
         <w:t>groupColumn</w:t>
       </w:r>
       <w:proofErr w:type="spellEnd"/>
-      <w:r>
-        <w:rPr>
-          <w:rFonts w:ascii="Courier New" w:hAnsi="Courier New" w:cs="Courier New"/>
-          <w:sz w:val="20"/>
-        </w:rPr>
-        <w:t>=”Group”,</w:t>
+      <w:proofErr w:type="gramStart"/>
+      <w:r>
+        <w:rPr>
+          <w:rFonts w:ascii="Courier New" w:hAnsi="Courier New" w:cs="Courier New"/>
+          <w:sz w:val="20"/>
+        </w:rPr>
+        <w:t>=”Group</w:t>
+      </w:r>
+      <w:proofErr w:type="gramEnd"/>
+      <w:r>
+        <w:rPr>
+          <w:rFonts w:ascii="Courier New" w:hAnsi="Courier New" w:cs="Courier New"/>
+          <w:sz w:val="20"/>
+        </w:rPr>
+        <w:t>”,</w:t>
       </w:r>
     </w:p>
     <w:p>
@@ -11994,6 +12010,7 @@
         <w:t>=</w:t>
       </w:r>
       <w:proofErr w:type="spellStart"/>
+      <w:proofErr w:type="gramStart"/>
       <w:r>
         <w:rPr>
           <w:rFonts w:ascii="Courier New" w:hAnsi="Courier New" w:cs="Courier New"/>
@@ -12007,7 +12024,15 @@
           <w:rFonts w:ascii="Courier New" w:hAnsi="Courier New" w:cs="Courier New"/>
           <w:sz w:val="20"/>
         </w:rPr>
-        <w:t>(),</w:t>
+        <w:t>(</w:t>
+      </w:r>
+      <w:proofErr w:type="gramEnd"/>
+      <w:r>
+        <w:rPr>
+          <w:rFonts w:ascii="Courier New" w:hAnsi="Courier New" w:cs="Courier New"/>
+          <w:sz w:val="20"/>
+        </w:rPr>
+        <w:t>),</w:t>
       </w:r>
     </w:p>
     <w:p>
@@ -12045,12 +12070,21 @@
         <w:t>annotationFile</w:t>
       </w:r>
       <w:proofErr w:type="spellEnd"/>
-      <w:r>
-        <w:rPr>
-          <w:rFonts w:ascii="Courier New" w:hAnsi="Courier New" w:cs="Courier New"/>
-          <w:sz w:val="20"/>
-        </w:rPr>
-        <w:t>=”Annotation.txt”,</w:t>
+      <w:proofErr w:type="gramStart"/>
+      <w:r>
+        <w:rPr>
+          <w:rFonts w:ascii="Courier New" w:hAnsi="Courier New" w:cs="Courier New"/>
+          <w:sz w:val="20"/>
+        </w:rPr>
+        <w:t>=”Annotation.txt</w:t>
+      </w:r>
+      <w:proofErr w:type="gramEnd"/>
+      <w:r>
+        <w:rPr>
+          <w:rFonts w:ascii="Courier New" w:hAnsi="Courier New" w:cs="Courier New"/>
+          <w:sz w:val="20"/>
+        </w:rPr>
+        <w:t>”,</w:t>
       </w:r>
     </w:p>
     <w:p>
@@ -12076,15 +12110,7 @@
           <w:rFonts w:ascii="Courier New" w:hAnsi="Courier New" w:cs="Courier New"/>
           <w:sz w:val="20"/>
         </w:rPr>
-        <w:t>=”Options.txt</w:t>
-      </w:r>
-      <w:proofErr w:type="gramEnd"/>
-      <w:r>
-        <w:rPr>
-          <w:rFonts w:ascii="Courier New" w:hAnsi="Courier New" w:cs="Courier New"/>
-          <w:sz w:val="20"/>
-        </w:rPr>
-        <w:t>”,</w:t>
+        <w:t>=”Options.txt”,</w:t>
       </w:r>
       <w:proofErr w:type="spellStart"/>
       <w:r>
@@ -12095,6 +12121,7 @@
         <w:t>doGeneSets</w:t>
       </w:r>
       <w:proofErr w:type="spellEnd"/>
+      <w:proofErr w:type="gramEnd"/>
       <w:r>
         <w:rPr>
           <w:rFonts w:ascii="Courier New" w:hAnsi="Courier New" w:cs="Courier New"/>
@@ -12216,26 +12243,32 @@
         <w:t>()”, “</w:t>
       </w:r>
       <w:proofErr w:type="spellStart"/>
+      <w:proofErr w:type="gramStart"/>
       <w:r>
         <w:t>pipe.RadarPlots</w:t>
       </w:r>
       <w:proofErr w:type="spellEnd"/>
+      <w:proofErr w:type="gramEnd"/>
       <w:r>
         <w:t>()”, “</w:t>
       </w:r>
       <w:proofErr w:type="spellStart"/>
+      <w:proofErr w:type="gramStart"/>
       <w:r>
         <w:t>pipe.QuSage</w:t>
       </w:r>
       <w:proofErr w:type="spellEnd"/>
+      <w:proofErr w:type="gramEnd"/>
       <w:r>
         <w:t>()”, and “</w:t>
       </w:r>
       <w:proofErr w:type="spellStart"/>
+      <w:proofErr w:type="gramStart"/>
       <w:r>
         <w:t>pipe.GenSetEnrichment</w:t>
       </w:r>
       <w:proofErr w:type="spellEnd"/>
+      <w:proofErr w:type="gramEnd"/>
       <w:r>
         <w:t>()”.   The default behavior of “</w:t>
       </w:r>
@@ -12440,7 +12473,15 @@
         <w:t xml:space="preserve"> (default=NULL)</w:t>
       </w:r>
       <w:r>
-        <w:t xml:space="preserve"> -- the name of the top level results folder that contains all data to be used (transcriptomes, etc.) and all result files that will be created.  The default value means to use the value of the “</w:t>
+        <w:t xml:space="preserve"> -- the name of the </w:t>
+      </w:r>
+      <w:proofErr w:type="gramStart"/>
+      <w:r>
+        <w:t>top level</w:t>
+      </w:r>
+      <w:proofErr w:type="gramEnd"/>
+      <w:r>
+        <w:t xml:space="preserve"> results folder that contains all data to be used (transcriptomes, etc.) and all result files that will be created.  The default value means to use the value of the “</w:t>
       </w:r>
       <w:proofErr w:type="spellStart"/>
       <w:proofErr w:type="gramStart"/>
@@ -12450,7 +12491,15 @@
       <w:proofErr w:type="spellEnd"/>
       <w:proofErr w:type="gramEnd"/>
       <w:r>
-        <w:t>” option  in the “Options.txt” file.</w:t>
+        <w:t xml:space="preserve">” </w:t>
+      </w:r>
+      <w:proofErr w:type="gramStart"/>
+      <w:r>
+        <w:t>option  in</w:t>
+      </w:r>
+      <w:proofErr w:type="gramEnd"/>
+      <w:r>
+        <w:t xml:space="preserve"> the “Options.txt” file.</w:t>
       </w:r>
     </w:p>
     <w:p>
@@ -13041,7 +13090,15 @@
       <w:proofErr w:type="spellEnd"/>
       <w:proofErr w:type="gramEnd"/>
       <w:r>
-        <w:t xml:space="preserve"> R function can better meet particular needs.  One example is given in the R source file called “</w:t>
+        <w:t xml:space="preserve"> R function can better meet </w:t>
+      </w:r>
+      <w:proofErr w:type="gramStart"/>
+      <w:r>
+        <w:t>particular needs</w:t>
+      </w:r>
+      <w:proofErr w:type="gramEnd"/>
+      <w:r>
+        <w:t>.  One example is given in the R source file called “</w:t>
       </w:r>
       <w:proofErr w:type="spellStart"/>
       <w:r>
@@ -13448,13 +13505,21 @@
         <w:t xml:space="preserve">  “</w:t>
       </w:r>
       <w:proofErr w:type="spellStart"/>
-      <w:proofErr w:type="gramEnd"/>
       <w:r>
         <w:t>pipe.VariantCalls</w:t>
       </w:r>
       <w:proofErr w:type="spellEnd"/>
-      <w:r>
-        <w:t xml:space="preserve">()”  on each sample.  </w:t>
+      <w:proofErr w:type="gramEnd"/>
+      <w:r>
+        <w:t>(</w:t>
+      </w:r>
+      <w:proofErr w:type="gramStart"/>
+      <w:r>
+        <w:t>)”  on</w:t>
+      </w:r>
+      <w:proofErr w:type="gramEnd"/>
+      <w:r>
+        <w:t xml:space="preserve"> each sample.  </w:t>
       </w:r>
       <w:r>
         <w:t>This routine evaluates all n</w:t>
@@ -13603,226 +13668,242 @@
         <w:t>function</w:t>
       </w:r>
       <w:r>
+        <w:t xml:space="preserve">  “pipe.VariantCalls</w:t>
+      </w:r>
+      <w:proofErr w:type="gramEnd"/>
+      <w:r>
+        <w:t>2</w:t>
+      </w:r>
+      <w:proofErr w:type="gramStart"/>
+      <w:r>
+        <w:t>html()”  on</w:t>
+      </w:r>
+      <w:proofErr w:type="gramEnd"/>
+      <w:r>
+        <w:t xml:space="preserve"> a sample.  This routine creates one HTML file with hyperlinks to images for each of the best high scoring SNPs detected in the sample.  Main arguments include:</w:t>
+      </w:r>
+    </w:p>
+    <w:p>
+      <w:pPr>
+        <w:pStyle w:val="ListParagraph"/>
+      </w:pPr>
+    </w:p>
+    <w:p>
+      <w:pPr>
+        <w:pStyle w:val="ListParagraph"/>
+        <w:rPr>
+          <w:rFonts w:asciiTheme="majorHAnsi" w:hAnsiTheme="majorHAnsi"/>
+        </w:rPr>
+      </w:pPr>
+      <w:proofErr w:type="spellStart"/>
+      <w:proofErr w:type="gramStart"/>
+      <w:r>
+        <w:rPr>
+          <w:rFonts w:asciiTheme="majorHAnsi" w:hAnsiTheme="majorHAnsi"/>
+          <w:b/>
+        </w:rPr>
+        <w:t>max.plots</w:t>
+      </w:r>
+      <w:proofErr w:type="spellEnd"/>
+      <w:proofErr w:type="gramEnd"/>
+      <w:r>
+        <w:rPr>
+          <w:rFonts w:asciiTheme="majorHAnsi" w:hAnsiTheme="majorHAnsi"/>
+          <w:b/>
+        </w:rPr>
+        <w:t xml:space="preserve"> (default = 200) </w:t>
+      </w:r>
+      <w:r>
+        <w:rPr>
+          <w:rFonts w:asciiTheme="majorHAnsi" w:hAnsiTheme="majorHAnsi"/>
+        </w:rPr>
+        <w:t>– maximum number of SNPs to plot.</w:t>
+      </w:r>
+    </w:p>
+    <w:p>
+      <w:pPr>
+        <w:pStyle w:val="ListParagraph"/>
+        <w:rPr>
+          <w:rFonts w:asciiTheme="majorHAnsi" w:hAnsiTheme="majorHAnsi"/>
+        </w:rPr>
+      </w:pPr>
+      <w:proofErr w:type="spellStart"/>
+      <w:proofErr w:type="gramStart"/>
+      <w:r>
+        <w:rPr>
+          <w:rFonts w:asciiTheme="majorHAnsi" w:hAnsiTheme="majorHAnsi"/>
+          <w:b/>
+        </w:rPr>
+        <w:t>min.score</w:t>
+      </w:r>
+      <w:proofErr w:type="spellEnd"/>
+      <w:proofErr w:type="gramEnd"/>
+      <w:r>
+        <w:rPr>
+          <w:rFonts w:asciiTheme="majorHAnsi" w:hAnsiTheme="majorHAnsi"/>
+          <w:b/>
+        </w:rPr>
+        <w:t xml:space="preserve"> (default = 100)</w:t>
+      </w:r>
+      <w:r>
+        <w:rPr>
+          <w:rFonts w:asciiTheme="majorHAnsi" w:hAnsiTheme="majorHAnsi"/>
+        </w:rPr>
+        <w:t xml:space="preserve"> – which SNPs to plot, ignore lower quality sites.</w:t>
+      </w:r>
+    </w:p>
+    <w:p>
+      <w:pPr>
+        <w:pStyle w:val="ListParagraph"/>
+        <w:rPr>
+          <w:rFonts w:asciiTheme="majorHAnsi" w:hAnsiTheme="majorHAnsi"/>
+        </w:rPr>
+      </w:pPr>
+      <w:proofErr w:type="spellStart"/>
+      <w:r>
+        <w:rPr>
+          <w:rFonts w:asciiTheme="majorHAnsi" w:hAnsiTheme="majorHAnsi"/>
+          <w:b/>
+        </w:rPr>
+        <w:t>altAA.only</w:t>
+      </w:r>
+      <w:proofErr w:type="spellEnd"/>
+      <w:r>
+        <w:rPr>
+          <w:rFonts w:asciiTheme="majorHAnsi" w:hAnsiTheme="majorHAnsi"/>
+          <w:b/>
+        </w:rPr>
+        <w:t xml:space="preserve"> (default = TRUE)</w:t>
+      </w:r>
+      <w:r>
+        <w:rPr>
+          <w:rFonts w:asciiTheme="majorHAnsi" w:hAnsiTheme="majorHAnsi"/>
+        </w:rPr>
+        <w:t xml:space="preserve"> – limit plotting to SNPs that change the gene’s protein coding sequence.</w:t>
+      </w:r>
+    </w:p>
+    <w:p>
+      <w:pPr>
+        <w:pStyle w:val="ListParagraph"/>
+        <w:rPr>
+          <w:rFonts w:asciiTheme="majorHAnsi" w:hAnsiTheme="majorHAnsi"/>
+        </w:rPr>
+      </w:pPr>
+      <w:proofErr w:type="spellStart"/>
+      <w:r>
+        <w:rPr>
+          <w:rFonts w:asciiTheme="majorHAnsi" w:hAnsiTheme="majorHAnsi"/>
+          <w:b/>
+        </w:rPr>
+        <w:t>tailWidth</w:t>
+      </w:r>
+      <w:proofErr w:type="spellEnd"/>
+      <w:r>
+        <w:rPr>
+          <w:rFonts w:asciiTheme="majorHAnsi" w:hAnsiTheme="majorHAnsi"/>
+          <w:b/>
+        </w:rPr>
+        <w:t xml:space="preserve"> (default = 46)</w:t>
+      </w:r>
+      <w:r>
+        <w:rPr>
+          <w:rFonts w:asciiTheme="majorHAnsi" w:hAnsiTheme="majorHAnsi"/>
+        </w:rPr>
+        <w:t xml:space="preserve"> – number of extra nucleotides on either side of the SNP site to include in the plot image.  Larger numbers show more </w:t>
+      </w:r>
+      <w:proofErr w:type="gramStart"/>
+      <w:r>
+        <w:rPr>
+          <w:rFonts w:asciiTheme="majorHAnsi" w:hAnsiTheme="majorHAnsi"/>
+        </w:rPr>
+        <w:t>context, but</w:t>
+      </w:r>
+      <w:proofErr w:type="gramEnd"/>
+      <w:r>
+        <w:rPr>
+          <w:rFonts w:asciiTheme="majorHAnsi" w:hAnsiTheme="majorHAnsi"/>
+        </w:rPr>
+        <w:t xml:space="preserve"> can make the image hard to interpret.  Smaller numbers show less </w:t>
+      </w:r>
+      <w:proofErr w:type="gramStart"/>
+      <w:r>
+        <w:rPr>
+          <w:rFonts w:asciiTheme="majorHAnsi" w:hAnsiTheme="majorHAnsi"/>
+        </w:rPr>
+        <w:t>context, but</w:t>
+      </w:r>
+      <w:proofErr w:type="gramEnd"/>
+      <w:r>
+        <w:rPr>
+          <w:rFonts w:asciiTheme="majorHAnsi" w:hAnsiTheme="majorHAnsi"/>
+        </w:rPr>
+        <w:t xml:space="preserve"> give a cleaner image.</w:t>
+      </w:r>
+    </w:p>
+    <w:p>
+      <w:pPr>
+        <w:pStyle w:val="ListParagraph"/>
+        <w:rPr>
+          <w:rFonts w:asciiTheme="majorHAnsi" w:hAnsiTheme="majorHAnsi"/>
+        </w:rPr>
+      </w:pPr>
+    </w:p>
+    <w:p>
+      <w:pPr>
+        <w:ind w:left="720"/>
+        <w:rPr>
+          <w:rFonts w:asciiTheme="majorHAnsi" w:hAnsiTheme="majorHAnsi"/>
+          <w:b/>
+          <w:sz w:val="28"/>
+        </w:rPr>
+      </w:pPr>
+      <w:r>
+        <w:rPr>
+          <w:rFonts w:asciiTheme="majorHAnsi" w:hAnsiTheme="majorHAnsi"/>
+          <w:b/>
+          <w:sz w:val="28"/>
+        </w:rPr>
+        <w:t>7.</w:t>
+      </w:r>
+      <w:r>
+        <w:rPr>
+          <w:rFonts w:asciiTheme="majorHAnsi" w:hAnsiTheme="majorHAnsi"/>
+          <w:b/>
+          <w:sz w:val="28"/>
+        </w:rPr>
+        <w:t>2.3.   Find differential SNPs between experimental groups:</w:t>
+      </w:r>
+    </w:p>
+    <w:p>
+      <w:pPr>
+        <w:pStyle w:val="ListParagraph"/>
+      </w:pPr>
+      <w:r>
+        <w:t xml:space="preserve">Run </w:t>
+      </w:r>
+      <w:proofErr w:type="gramStart"/>
+      <w:r>
+        <w:t>function</w:t>
+      </w:r>
+      <w:r>
         <w:t xml:space="preserve">  “</w:t>
       </w:r>
-      <w:proofErr w:type="gramEnd"/>
-      <w:r>
-        <w:t>pipe.VariantCalls2html()”  on a sample.  This routine creates one HTML file with hyperlinks to images for each of the best high scoring SNPs detected in the sample.  Main arguments include:</w:t>
-      </w:r>
-    </w:p>
-    <w:p>
-      <w:pPr>
-        <w:pStyle w:val="ListParagraph"/>
-      </w:pPr>
-    </w:p>
-    <w:p>
-      <w:pPr>
-        <w:pStyle w:val="ListParagraph"/>
-        <w:rPr>
-          <w:rFonts w:asciiTheme="majorHAnsi" w:hAnsiTheme="majorHAnsi"/>
-        </w:rPr>
-      </w:pPr>
-      <w:proofErr w:type="spellStart"/>
-      <w:proofErr w:type="gramStart"/>
-      <w:r>
-        <w:rPr>
-          <w:rFonts w:asciiTheme="majorHAnsi" w:hAnsiTheme="majorHAnsi"/>
-          <w:b/>
-        </w:rPr>
-        <w:t>max.plots</w:t>
-      </w:r>
-      <w:proofErr w:type="spellEnd"/>
-      <w:proofErr w:type="gramEnd"/>
-      <w:r>
-        <w:rPr>
-          <w:rFonts w:asciiTheme="majorHAnsi" w:hAnsiTheme="majorHAnsi"/>
-          <w:b/>
-        </w:rPr>
-        <w:t xml:space="preserve"> (default = 200) </w:t>
-      </w:r>
-      <w:r>
-        <w:rPr>
-          <w:rFonts w:asciiTheme="majorHAnsi" w:hAnsiTheme="majorHAnsi"/>
-        </w:rPr>
-        <w:t>– maximum number of SNPs to plot.</w:t>
-      </w:r>
-    </w:p>
-    <w:p>
-      <w:pPr>
-        <w:pStyle w:val="ListParagraph"/>
-        <w:rPr>
-          <w:rFonts w:asciiTheme="majorHAnsi" w:hAnsiTheme="majorHAnsi"/>
-        </w:rPr>
-      </w:pPr>
-      <w:proofErr w:type="spellStart"/>
-      <w:proofErr w:type="gramStart"/>
-      <w:r>
-        <w:rPr>
-          <w:rFonts w:asciiTheme="majorHAnsi" w:hAnsiTheme="majorHAnsi"/>
-          <w:b/>
-        </w:rPr>
-        <w:t>min.score</w:t>
-      </w:r>
-      <w:proofErr w:type="spellEnd"/>
-      <w:proofErr w:type="gramEnd"/>
-      <w:r>
-        <w:rPr>
-          <w:rFonts w:asciiTheme="majorHAnsi" w:hAnsiTheme="majorHAnsi"/>
-          <w:b/>
-        </w:rPr>
-        <w:t xml:space="preserve"> (default = 100)</w:t>
-      </w:r>
-      <w:r>
-        <w:rPr>
-          <w:rFonts w:asciiTheme="majorHAnsi" w:hAnsiTheme="majorHAnsi"/>
-        </w:rPr>
-        <w:t xml:space="preserve"> – which SNPs to plot, ignore lower quality sites.</w:t>
-      </w:r>
-    </w:p>
-    <w:p>
-      <w:pPr>
-        <w:pStyle w:val="ListParagraph"/>
-        <w:rPr>
-          <w:rFonts w:asciiTheme="majorHAnsi" w:hAnsiTheme="majorHAnsi"/>
-        </w:rPr>
-      </w:pPr>
-      <w:proofErr w:type="spellStart"/>
-      <w:r>
-        <w:rPr>
-          <w:rFonts w:asciiTheme="majorHAnsi" w:hAnsiTheme="majorHAnsi"/>
-          <w:b/>
-        </w:rPr>
-        <w:t>altAA.only</w:t>
-      </w:r>
-      <w:proofErr w:type="spellEnd"/>
-      <w:r>
-        <w:rPr>
-          <w:rFonts w:asciiTheme="majorHAnsi" w:hAnsiTheme="majorHAnsi"/>
-          <w:b/>
-        </w:rPr>
-        <w:t xml:space="preserve"> (default = TRUE)</w:t>
-      </w:r>
-      <w:r>
-        <w:rPr>
-          <w:rFonts w:asciiTheme="majorHAnsi" w:hAnsiTheme="majorHAnsi"/>
-        </w:rPr>
-        <w:t xml:space="preserve"> – limit plotting to SNPs that change the gene’s protein coding sequence.</w:t>
-      </w:r>
-    </w:p>
-    <w:p>
-      <w:pPr>
-        <w:pStyle w:val="ListParagraph"/>
-        <w:rPr>
-          <w:rFonts w:asciiTheme="majorHAnsi" w:hAnsiTheme="majorHAnsi"/>
-        </w:rPr>
-      </w:pPr>
-      <w:proofErr w:type="spellStart"/>
-      <w:r>
-        <w:rPr>
-          <w:rFonts w:asciiTheme="majorHAnsi" w:hAnsiTheme="majorHAnsi"/>
-          <w:b/>
-        </w:rPr>
-        <w:t>tailWidth</w:t>
-      </w:r>
-      <w:proofErr w:type="spellEnd"/>
-      <w:r>
-        <w:rPr>
-          <w:rFonts w:asciiTheme="majorHAnsi" w:hAnsiTheme="majorHAnsi"/>
-          <w:b/>
-        </w:rPr>
-        <w:t xml:space="preserve"> (default = 46)</w:t>
-      </w:r>
-      <w:r>
-        <w:rPr>
-          <w:rFonts w:asciiTheme="majorHAnsi" w:hAnsiTheme="majorHAnsi"/>
-        </w:rPr>
-        <w:t xml:space="preserve"> – number of extra nucleotides on either side of the SNP site to include in the plot image.  Larger numbers show more </w:t>
-      </w:r>
-      <w:proofErr w:type="gramStart"/>
-      <w:r>
-        <w:rPr>
-          <w:rFonts w:asciiTheme="majorHAnsi" w:hAnsiTheme="majorHAnsi"/>
-        </w:rPr>
-        <w:t>context, but</w:t>
-      </w:r>
-      <w:proofErr w:type="gramEnd"/>
-      <w:r>
-        <w:rPr>
-          <w:rFonts w:asciiTheme="majorHAnsi" w:hAnsiTheme="majorHAnsi"/>
-        </w:rPr>
-        <w:t xml:space="preserve"> can make the image hard to interpret.  Smaller numbers show less </w:t>
-      </w:r>
-      <w:proofErr w:type="gramStart"/>
-      <w:r>
-        <w:rPr>
-          <w:rFonts w:asciiTheme="majorHAnsi" w:hAnsiTheme="majorHAnsi"/>
-        </w:rPr>
-        <w:t>context, but</w:t>
-      </w:r>
-      <w:proofErr w:type="gramEnd"/>
-      <w:r>
-        <w:rPr>
-          <w:rFonts w:asciiTheme="majorHAnsi" w:hAnsiTheme="majorHAnsi"/>
-        </w:rPr>
-        <w:t xml:space="preserve"> give a cleaner image.</w:t>
-      </w:r>
-    </w:p>
-    <w:p>
-      <w:pPr>
-        <w:pStyle w:val="ListParagraph"/>
-        <w:rPr>
-          <w:rFonts w:asciiTheme="majorHAnsi" w:hAnsiTheme="majorHAnsi"/>
-        </w:rPr>
-      </w:pPr>
-    </w:p>
-    <w:p>
-      <w:pPr>
-        <w:ind w:left="720"/>
-        <w:rPr>
-          <w:rFonts w:asciiTheme="majorHAnsi" w:hAnsiTheme="majorHAnsi"/>
-          <w:b/>
-          <w:sz w:val="28"/>
-        </w:rPr>
-      </w:pPr>
-      <w:r>
-        <w:rPr>
-          <w:rFonts w:asciiTheme="majorHAnsi" w:hAnsiTheme="majorHAnsi"/>
-          <w:b/>
-          <w:sz w:val="28"/>
-        </w:rPr>
-        <w:t>7.</w:t>
-      </w:r>
-      <w:r>
-        <w:rPr>
-          <w:rFonts w:asciiTheme="majorHAnsi" w:hAnsiTheme="majorHAnsi"/>
-          <w:b/>
-          <w:sz w:val="28"/>
-        </w:rPr>
-        <w:t>2.3.   Find differential SNPs between experimental groups:</w:t>
-      </w:r>
-    </w:p>
-    <w:p>
-      <w:pPr>
-        <w:pStyle w:val="ListParagraph"/>
-      </w:pPr>
-      <w:r>
-        <w:t xml:space="preserve">Run </w:t>
-      </w:r>
-      <w:proofErr w:type="gramStart"/>
-      <w:r>
-        <w:t>function</w:t>
-      </w:r>
-      <w:r>
-        <w:t xml:space="preserve">  “</w:t>
-      </w:r>
-      <w:proofErr w:type="spellStart"/>
-      <w:proofErr w:type="gramEnd"/>
+      <w:proofErr w:type="spellStart"/>
       <w:r>
         <w:t>pipe.VariantComparison</w:t>
       </w:r>
       <w:proofErr w:type="spellEnd"/>
-      <w:r>
-        <w:t xml:space="preserve">()”  on a set of samples from 2 or more groups/conditions.  This routine evaluates all SNP calls in the given </w:t>
+      <w:proofErr w:type="gramEnd"/>
+      <w:r>
+        <w:t>(</w:t>
+      </w:r>
+      <w:proofErr w:type="gramStart"/>
+      <w:r>
+        <w:t>)”  on</w:t>
+      </w:r>
+      <w:proofErr w:type="gramEnd"/>
+      <w:r>
+        <w:t xml:space="preserve"> a set of samples from 2 or more groups/conditions.  This routine evaluates all SNP calls in the given </w:t>
       </w:r>
       <w:proofErr w:type="gramStart"/>
       <w:r>
@@ -13883,49 +13964,185 @@
         <w:t xml:space="preserve">The tool performs best given exactly 2 groups, where the SNP patterns between the groups are </w:t>
       </w:r>
       <w:r>
-        <w:t xml:space="preserve">somewhat </w:t>
-      </w:r>
-      <w:proofErr w:type="gramStart"/>
-      <w:r>
-        <w:t xml:space="preserve">conserved, </w:t>
-      </w:r>
-      <w:r>
-        <w:t>but</w:t>
-      </w:r>
-      <w:proofErr w:type="gramEnd"/>
-      <w:r>
+        <w:t xml:space="preserve">somewhat conserved, </w:t>
+      </w:r>
+      <w:r>
+        <w:t xml:space="preserve">but </w:t>
+      </w:r>
+      <w:r>
+        <w:t>can handle</w:t>
+      </w:r>
+      <w:r>
+        <w:t xml:space="preserve"> more</w:t>
+      </w:r>
+      <w:r>
+        <w:t xml:space="preserve"> groups with high SNP variability</w:t>
+      </w:r>
+      <w:r>
+        <w:t>.</w:t>
+      </w:r>
+    </w:p>
+    <w:p>
+      <w:pPr>
+        <w:pStyle w:val="ListParagraph"/>
+      </w:pPr>
+    </w:p>
+    <w:p>
+      <w:pPr>
+        <w:pStyle w:val="ListParagraph"/>
+      </w:pPr>
+      <w:r>
+        <w:t>Main arguments include:</w:t>
+      </w:r>
+    </w:p>
+    <w:p>
+      <w:pPr>
+        <w:pStyle w:val="ListParagraph"/>
+      </w:pPr>
+    </w:p>
+    <w:p>
+      <w:pPr>
+        <w:pStyle w:val="ListParagraph"/>
+        <w:rPr>
+          <w:rFonts w:asciiTheme="majorHAnsi" w:hAnsiTheme="majorHAnsi"/>
+        </w:rPr>
+      </w:pPr>
+      <w:proofErr w:type="spellStart"/>
+      <w:r>
+        <w:rPr>
+          <w:rFonts w:asciiTheme="majorHAnsi" w:hAnsiTheme="majorHAnsi"/>
+          <w:b/>
+        </w:rPr>
+        <w:t>sampleIDset</w:t>
+      </w:r>
+      <w:proofErr w:type="spellEnd"/>
+      <w:r>
+        <w:rPr>
+          <w:rFonts w:asciiTheme="majorHAnsi" w:hAnsiTheme="majorHAnsi"/>
+          <w:b/>
+        </w:rPr>
         <w:t xml:space="preserve"> </w:t>
       </w:r>
       <w:r>
-        <w:t>can handle</w:t>
-      </w:r>
-      <w:r>
-        <w:t xml:space="preserve"> more</w:t>
-      </w:r>
-      <w:r>
-        <w:t xml:space="preserve"> groups with high SNP variability</w:t>
-      </w:r>
-      <w:r>
-        <w:t>.</w:t>
+        <w:rPr>
+          <w:rFonts w:asciiTheme="majorHAnsi" w:hAnsiTheme="majorHAnsi"/>
+        </w:rPr>
+        <w:t xml:space="preserve">– the set of 2 or more samples to be compared. </w:t>
       </w:r>
     </w:p>
     <w:p>
       <w:pPr>
         <w:pStyle w:val="ListParagraph"/>
-      </w:pPr>
+        <w:rPr>
+          <w:rFonts w:asciiTheme="majorHAnsi" w:hAnsiTheme="majorHAnsi"/>
+        </w:rPr>
+      </w:pPr>
+      <w:proofErr w:type="spellStart"/>
+      <w:r>
+        <w:rPr>
+          <w:rFonts w:asciiTheme="majorHAnsi" w:hAnsiTheme="majorHAnsi"/>
+          <w:b/>
+        </w:rPr>
+        <w:t>groupSet</w:t>
+      </w:r>
+      <w:proofErr w:type="spellEnd"/>
+      <w:r>
+        <w:rPr>
+          <w:rFonts w:asciiTheme="majorHAnsi" w:hAnsiTheme="majorHAnsi"/>
+          <w:b/>
+        </w:rPr>
+        <w:t xml:space="preserve"> </w:t>
+      </w:r>
+      <w:proofErr w:type="gramStart"/>
+      <w:r>
+        <w:rPr>
+          <w:rFonts w:asciiTheme="majorHAnsi" w:hAnsiTheme="majorHAnsi"/>
+        </w:rPr>
+        <w:t>-  the</w:t>
+      </w:r>
+      <w:proofErr w:type="gramEnd"/>
+      <w:r>
+        <w:rPr>
+          <w:rFonts w:asciiTheme="majorHAnsi" w:hAnsiTheme="majorHAnsi"/>
+        </w:rPr>
+        <w:t xml:space="preserve"> group names for each sample, used to partition the samples into 2 or more groups.</w:t>
+      </w:r>
     </w:p>
     <w:p>
       <w:pPr>
         <w:pStyle w:val="ListParagraph"/>
-      </w:pPr>
-      <w:r>
-        <w:t>Main arguments include:</w:t>
+        <w:rPr>
+          <w:rFonts w:asciiTheme="majorHAnsi" w:hAnsiTheme="majorHAnsi"/>
+        </w:rPr>
+      </w:pPr>
+      <w:proofErr w:type="spellStart"/>
+      <w:proofErr w:type="gramStart"/>
+      <w:r>
+        <w:rPr>
+          <w:rFonts w:asciiTheme="majorHAnsi" w:hAnsiTheme="majorHAnsi"/>
+          <w:b/>
+        </w:rPr>
+        <w:t>min.deltaScore</w:t>
+      </w:r>
+      <w:proofErr w:type="spellEnd"/>
+      <w:proofErr w:type="gramEnd"/>
+      <w:r>
+        <w:rPr>
+          <w:rFonts w:asciiTheme="majorHAnsi" w:hAnsiTheme="majorHAnsi"/>
+          <w:b/>
+        </w:rPr>
+        <w:t xml:space="preserve"> (default = 40)</w:t>
+      </w:r>
+      <w:r>
+        <w:rPr>
+          <w:rFonts w:asciiTheme="majorHAnsi" w:hAnsiTheme="majorHAnsi"/>
+        </w:rPr>
+        <w:t xml:space="preserve"> – only keep SNP sites where the difference in </w:t>
+      </w:r>
+      <w:proofErr w:type="gramStart"/>
+      <w:r>
+        <w:rPr>
+          <w:rFonts w:asciiTheme="majorHAnsi" w:hAnsiTheme="majorHAnsi"/>
+        </w:rPr>
+        <w:t>score  between</w:t>
+      </w:r>
+      <w:proofErr w:type="gramEnd"/>
+      <w:r>
+        <w:rPr>
+          <w:rFonts w:asciiTheme="majorHAnsi" w:hAnsiTheme="majorHAnsi"/>
+        </w:rPr>
+        <w:t xml:space="preserve"> 2 groups is at least this large.</w:t>
       </w:r>
     </w:p>
     <w:p>
       <w:pPr>
         <w:pStyle w:val="ListParagraph"/>
-      </w:pPr>
+        <w:rPr>
+          <w:rFonts w:asciiTheme="majorHAnsi" w:hAnsiTheme="majorHAnsi"/>
+        </w:rPr>
+      </w:pPr>
+      <w:proofErr w:type="spellStart"/>
+      <w:r>
+        <w:rPr>
+          <w:rFonts w:asciiTheme="majorHAnsi" w:hAnsiTheme="majorHAnsi"/>
+          <w:b/>
+        </w:rPr>
+        <w:t>exonOnly</w:t>
+      </w:r>
+      <w:proofErr w:type="spellEnd"/>
+      <w:r>
+        <w:rPr>
+          <w:rFonts w:asciiTheme="majorHAnsi" w:hAnsiTheme="majorHAnsi"/>
+          <w:b/>
+        </w:rPr>
+        <w:t xml:space="preserve"> (default = FALSE) </w:t>
+      </w:r>
+      <w:r>
+        <w:rPr>
+          <w:rFonts w:asciiTheme="majorHAnsi" w:hAnsiTheme="majorHAnsi"/>
+        </w:rPr>
+        <w:t>– if TRUE, only consider SNPs in coding exons.</w:t>
+      </w:r>
     </w:p>
     <w:p>
       <w:pPr>
@@ -13940,13 +14157,25 @@
           <w:rFonts w:asciiTheme="majorHAnsi" w:hAnsiTheme="majorHAnsi"/>
           <w:b/>
         </w:rPr>
-        <w:t>sampleIDset</w:t>
-      </w:r>
-      <w:proofErr w:type="spellEnd"/>
-      <w:r>
-        <w:rPr>
-          <w:rFonts w:asciiTheme="majorHAnsi" w:hAnsiTheme="majorHAnsi"/>
-          <w:b/>
+        <w:t>snpOnly</w:t>
+      </w:r>
+      <w:proofErr w:type="spellEnd"/>
+      <w:r>
+        <w:rPr>
+          <w:rFonts w:asciiTheme="majorHAnsi" w:hAnsiTheme="majorHAnsi"/>
+          <w:b/>
+        </w:rPr>
+        <w:t xml:space="preserve"> (default = FALSE)</w:t>
+      </w:r>
+      <w:r>
+        <w:rPr>
+          <w:rFonts w:asciiTheme="majorHAnsi" w:hAnsiTheme="majorHAnsi"/>
+        </w:rPr>
+        <w:t xml:space="preserve"> – if TRUE, ignore Insertion and deletion sites.</w:t>
+      </w:r>
+      <w:r>
+        <w:rPr>
+          <w:rFonts w:asciiTheme="majorHAnsi" w:hAnsiTheme="majorHAnsi"/>
         </w:rPr>
         <w:t xml:space="preserve"> </w:t>
       </w:r>
@@ -13954,7 +14183,19 @@
         <w:rPr>
           <w:rFonts w:asciiTheme="majorHAnsi" w:hAnsiTheme="majorHAnsi"/>
         </w:rPr>
-        <w:t xml:space="preserve">– the set of 2 or more samples to be compared. </w:t>
+        <w:t>These are common in highly variant gene families, usually false SNPs, and can easily dominate the results file.  Ignoring thes</w:t>
+      </w:r>
+      <w:r>
+        <w:rPr>
+          <w:rFonts w:asciiTheme="majorHAnsi" w:hAnsiTheme="majorHAnsi"/>
+        </w:rPr>
+        <w:t>e tends to help find the most meaningful</w:t>
+      </w:r>
+      <w:r>
+        <w:rPr>
+          <w:rFonts w:asciiTheme="majorHAnsi" w:hAnsiTheme="majorHAnsi"/>
+        </w:rPr>
+        <w:t xml:space="preserve"> differential SNP sites.</w:t>
       </w:r>
     </w:p>
     <w:p>
@@ -13970,30 +14211,44 @@
           <w:rFonts w:asciiTheme="majorHAnsi" w:hAnsiTheme="majorHAnsi"/>
           <w:b/>
         </w:rPr>
-        <w:t>groupSet</w:t>
-      </w:r>
-      <w:proofErr w:type="spellEnd"/>
-      <w:r>
-        <w:rPr>
-          <w:rFonts w:asciiTheme="majorHAnsi" w:hAnsiTheme="majorHAnsi"/>
-          <w:b/>
+        <w:t>AAsnpOnly</w:t>
+      </w:r>
+      <w:proofErr w:type="spellEnd"/>
+      <w:r>
+        <w:rPr>
+          <w:rFonts w:asciiTheme="majorHAnsi" w:hAnsiTheme="majorHAnsi"/>
+          <w:b/>
+        </w:rPr>
+        <w:t xml:space="preserve"> (default = </w:t>
+      </w:r>
+      <w:proofErr w:type="spellStart"/>
+      <w:r>
+        <w:rPr>
+          <w:rFonts w:asciiTheme="majorHAnsi" w:hAnsiTheme="majorHAnsi"/>
+          <w:b/>
+        </w:rPr>
+        <w:t>exonOnly</w:t>
+      </w:r>
+      <w:proofErr w:type="spellEnd"/>
+      <w:r>
+        <w:rPr>
+          <w:rFonts w:asciiTheme="majorHAnsi" w:hAnsiTheme="majorHAnsi"/>
+          <w:b/>
+        </w:rPr>
+        <w:t>)</w:t>
+      </w:r>
+      <w:r>
+        <w:rPr>
+          <w:rFonts w:asciiTheme="majorHAnsi" w:hAnsiTheme="majorHAnsi"/>
+        </w:rPr>
+        <w:t xml:space="preserve"> – if TRUE, only consider SNP sites where at least one group changes the gene’s protein coding sequence.</w:t>
+      </w:r>
+      <w:r>
+        <w:rPr>
+          <w:rFonts w:asciiTheme="majorHAnsi" w:hAnsiTheme="majorHAnsi"/>
         </w:rPr>
         <w:t xml:space="preserve"> </w:t>
       </w:r>
-      <w:proofErr w:type="gramStart"/>
-      <w:r>
-        <w:rPr>
-          <w:rFonts w:asciiTheme="majorHAnsi" w:hAnsiTheme="majorHAnsi"/>
-        </w:rPr>
-        <w:t>-  the</w:t>
-      </w:r>
-      <w:proofErr w:type="gramEnd"/>
-      <w:r>
-        <w:rPr>
-          <w:rFonts w:asciiTheme="majorHAnsi" w:hAnsiTheme="majorHAnsi"/>
-        </w:rPr>
-        <w:t xml:space="preserve"> group names for each sample, used to partition the samples into 2 or more groups.</w:t>
-      </w:r>
     </w:p>
     <w:p>
       <w:pPr>
@@ -14003,28 +14258,58 @@
         </w:rPr>
       </w:pPr>
       <w:proofErr w:type="spellStart"/>
-      <w:proofErr w:type="gramStart"/>
-      <w:r>
-        <w:rPr>
-          <w:rFonts w:asciiTheme="majorHAnsi" w:hAnsiTheme="majorHAnsi"/>
-          <w:b/>
-        </w:rPr>
-        <w:t>min.deltaScore</w:t>
-      </w:r>
-      <w:proofErr w:type="spellEnd"/>
-      <w:proofErr w:type="gramEnd"/>
-      <w:r>
-        <w:rPr>
-          <w:rFonts w:asciiTheme="majorHAnsi" w:hAnsiTheme="majorHAnsi"/>
-          <w:b/>
-        </w:rPr>
-        <w:t xml:space="preserve"> (default = 40)</w:t>
-      </w:r>
-      <w:r>
-        <w:rPr>
-          <w:rFonts w:asciiTheme="majorHAnsi" w:hAnsiTheme="majorHAnsi"/>
-        </w:rPr>
-        <w:t xml:space="preserve"> – only keep SNP sites where the difference in score  between 2 groups is at least this large.</w:t>
+      <w:r>
+        <w:rPr>
+          <w:rFonts w:asciiTheme="majorHAnsi" w:hAnsiTheme="majorHAnsi"/>
+          <w:b/>
+        </w:rPr>
+        <w:t>capScore</w:t>
+      </w:r>
+      <w:proofErr w:type="spellEnd"/>
+      <w:r>
+        <w:rPr>
+          <w:rFonts w:asciiTheme="majorHAnsi" w:hAnsiTheme="majorHAnsi"/>
+          <w:b/>
+        </w:rPr>
+        <w:t xml:space="preserve"> (default </w:t>
+      </w:r>
+      <w:r>
+        <w:rPr>
+          <w:rFonts w:asciiTheme="majorHAnsi" w:hAnsiTheme="majorHAnsi"/>
+          <w:b/>
+        </w:rPr>
+        <w:t>=100</w:t>
+      </w:r>
+      <w:r>
+        <w:rPr>
+          <w:rFonts w:asciiTheme="majorHAnsi" w:hAnsiTheme="majorHAnsi"/>
+          <w:b/>
+        </w:rPr>
+        <w:t>)</w:t>
+      </w:r>
+      <w:r>
+        <w:rPr>
+          <w:rFonts w:asciiTheme="majorHAnsi" w:hAnsiTheme="majorHAnsi"/>
+        </w:rPr>
+        <w:t xml:space="preserve"> – if 2 or more groups have different non-reference allele SNPs</w:t>
+      </w:r>
+      <w:r>
+        <w:rPr>
+          <w:rFonts w:asciiTheme="majorHAnsi" w:hAnsiTheme="majorHAnsi"/>
+        </w:rPr>
+        <w:t xml:space="preserve"> at the exact same site</w:t>
+      </w:r>
+      <w:r>
+        <w:rPr>
+          <w:rFonts w:asciiTheme="majorHAnsi" w:hAnsiTheme="majorHAnsi"/>
+        </w:rPr>
+        <w:t>, the difference in their score</w:t>
+      </w:r>
+      <w:r>
+        <w:rPr>
+          <w:rFonts w:asciiTheme="majorHAnsi" w:hAnsiTheme="majorHAnsi"/>
+        </w:rPr>
+        <w:t>s will be set to larger than the highest possible score.  This feature lets us find highly variant sites where just being ‘different from the reference’ is not the only criteria.  To enable this highly variant search, raise the value above 100 up to a maximum of 200.</w:t>
       </w:r>
     </w:p>
     <w:p>
@@ -14034,266 +14319,68 @@
           <w:rFonts w:asciiTheme="majorHAnsi" w:hAnsiTheme="majorHAnsi"/>
         </w:rPr>
       </w:pPr>
-      <w:proofErr w:type="spellStart"/>
-      <w:r>
-        <w:rPr>
-          <w:rFonts w:asciiTheme="majorHAnsi" w:hAnsiTheme="majorHAnsi"/>
-          <w:b/>
-        </w:rPr>
-        <w:t>exonOnly</w:t>
-      </w:r>
-      <w:proofErr w:type="spellEnd"/>
-      <w:r>
-        <w:rPr>
-          <w:rFonts w:asciiTheme="majorHAnsi" w:hAnsiTheme="majorHAnsi"/>
-          <w:b/>
-        </w:rPr>
-        <w:t xml:space="preserve"> (default = FALSE) </w:t>
-      </w:r>
-      <w:r>
-        <w:rPr>
-          <w:rFonts w:asciiTheme="majorHAnsi" w:hAnsiTheme="majorHAnsi"/>
-        </w:rPr>
-        <w:t>– if TRUE, only consider SNPs in coding exons.</w:t>
+    </w:p>
+    <w:p>
+      <w:pPr>
+        <w:ind w:left="720"/>
+        <w:rPr>
+          <w:rFonts w:asciiTheme="majorHAnsi" w:hAnsiTheme="majorHAnsi"/>
+          <w:b/>
+          <w:sz w:val="28"/>
+        </w:rPr>
+      </w:pPr>
+      <w:r>
+        <w:rPr>
+          <w:rFonts w:asciiTheme="majorHAnsi" w:hAnsiTheme="majorHAnsi"/>
+          <w:b/>
+          <w:sz w:val="28"/>
+        </w:rPr>
+        <w:t>7.</w:t>
+      </w:r>
+      <w:r>
+        <w:rPr>
+          <w:rFonts w:asciiTheme="majorHAnsi" w:hAnsiTheme="majorHAnsi"/>
+          <w:b/>
+          <w:sz w:val="28"/>
+        </w:rPr>
+        <w:t xml:space="preserve">2.4.   Write &amp; </w:t>
+      </w:r>
+      <w:r>
+        <w:rPr>
+          <w:rFonts w:asciiTheme="majorHAnsi" w:hAnsiTheme="majorHAnsi"/>
+          <w:b/>
+          <w:sz w:val="28"/>
+        </w:rPr>
+        <w:t>p</w:t>
+      </w:r>
+      <w:r>
+        <w:rPr>
+          <w:rFonts w:asciiTheme="majorHAnsi" w:hAnsiTheme="majorHAnsi"/>
+          <w:b/>
+          <w:sz w:val="28"/>
+        </w:rPr>
+        <w:t xml:space="preserve">lot differential SNPs </w:t>
+      </w:r>
+      <w:r>
+        <w:rPr>
+          <w:rFonts w:asciiTheme="majorHAnsi" w:hAnsiTheme="majorHAnsi"/>
+          <w:b/>
+          <w:sz w:val="28"/>
+        </w:rPr>
+        <w:t>results</w:t>
+      </w:r>
+      <w:r>
+        <w:rPr>
+          <w:rFonts w:asciiTheme="majorHAnsi" w:hAnsiTheme="majorHAnsi"/>
+          <w:b/>
+          <w:sz w:val="28"/>
+        </w:rPr>
+        <w:t>:</w:t>
       </w:r>
     </w:p>
     <w:p>
       <w:pPr>
         <w:pStyle w:val="ListParagraph"/>
-        <w:rPr>
-          <w:rFonts w:asciiTheme="majorHAnsi" w:hAnsiTheme="majorHAnsi"/>
-        </w:rPr>
-      </w:pPr>
-      <w:proofErr w:type="spellStart"/>
-      <w:r>
-        <w:rPr>
-          <w:rFonts w:asciiTheme="majorHAnsi" w:hAnsiTheme="majorHAnsi"/>
-          <w:b/>
-        </w:rPr>
-        <w:t>snpOnly</w:t>
-      </w:r>
-      <w:proofErr w:type="spellEnd"/>
-      <w:r>
-        <w:rPr>
-          <w:rFonts w:asciiTheme="majorHAnsi" w:hAnsiTheme="majorHAnsi"/>
-          <w:b/>
-        </w:rPr>
-        <w:t xml:space="preserve"> (default = FALSE)</w:t>
-      </w:r>
-      <w:r>
-        <w:rPr>
-          <w:rFonts w:asciiTheme="majorHAnsi" w:hAnsiTheme="majorHAnsi"/>
-        </w:rPr>
-        <w:t xml:space="preserve"> – if TRUE, ignore Insertion and deletion sites.</w:t>
-      </w:r>
-      <w:r>
-        <w:rPr>
-          <w:rFonts w:asciiTheme="majorHAnsi" w:hAnsiTheme="majorHAnsi"/>
-        </w:rPr>
-        <w:t xml:space="preserve"> </w:t>
-      </w:r>
-      <w:r>
-        <w:rPr>
-          <w:rFonts w:asciiTheme="majorHAnsi" w:hAnsiTheme="majorHAnsi"/>
-        </w:rPr>
-        <w:t>These are common in highly variant gene families, usually false SNPs, and can easily dominate the results file.  Ignoring thes</w:t>
-      </w:r>
-      <w:r>
-        <w:rPr>
-          <w:rFonts w:asciiTheme="majorHAnsi" w:hAnsiTheme="majorHAnsi"/>
-        </w:rPr>
-        <w:t>e tends to help find the most meaningful</w:t>
-      </w:r>
-      <w:r>
-        <w:rPr>
-          <w:rFonts w:asciiTheme="majorHAnsi" w:hAnsiTheme="majorHAnsi"/>
-        </w:rPr>
-        <w:t xml:space="preserve"> differential SNP sites.</w:t>
-      </w:r>
-    </w:p>
-    <w:p>
-      <w:pPr>
-        <w:pStyle w:val="ListParagraph"/>
-        <w:rPr>
-          <w:rFonts w:asciiTheme="majorHAnsi" w:hAnsiTheme="majorHAnsi"/>
-        </w:rPr>
-      </w:pPr>
-      <w:proofErr w:type="spellStart"/>
-      <w:r>
-        <w:rPr>
-          <w:rFonts w:asciiTheme="majorHAnsi" w:hAnsiTheme="majorHAnsi"/>
-          <w:b/>
-        </w:rPr>
-        <w:t>AAsnpOnly</w:t>
-      </w:r>
-      <w:proofErr w:type="spellEnd"/>
-      <w:r>
-        <w:rPr>
-          <w:rFonts w:asciiTheme="majorHAnsi" w:hAnsiTheme="majorHAnsi"/>
-          <w:b/>
-        </w:rPr>
-        <w:t xml:space="preserve"> (default = </w:t>
-      </w:r>
-      <w:proofErr w:type="spellStart"/>
-      <w:r>
-        <w:rPr>
-          <w:rFonts w:asciiTheme="majorHAnsi" w:hAnsiTheme="majorHAnsi"/>
-          <w:b/>
-        </w:rPr>
-        <w:t>exonOnly</w:t>
-      </w:r>
-      <w:proofErr w:type="spellEnd"/>
-      <w:r>
-        <w:rPr>
-          <w:rFonts w:asciiTheme="majorHAnsi" w:hAnsiTheme="majorHAnsi"/>
-          <w:b/>
-        </w:rPr>
-        <w:t>)</w:t>
-      </w:r>
-      <w:r>
-        <w:rPr>
-          <w:rFonts w:asciiTheme="majorHAnsi" w:hAnsiTheme="majorHAnsi"/>
-        </w:rPr>
-        <w:t xml:space="preserve"> – if TRUE, only consider SNP sites where at least one group changes the gene’s protein coding sequence.</w:t>
-      </w:r>
-      <w:r>
-        <w:rPr>
-          <w:rFonts w:asciiTheme="majorHAnsi" w:hAnsiTheme="majorHAnsi"/>
-        </w:rPr>
-        <w:t xml:space="preserve"> </w:t>
-      </w:r>
-    </w:p>
-    <w:p>
-      <w:pPr>
-        <w:pStyle w:val="ListParagraph"/>
-        <w:rPr>
-          <w:rFonts w:asciiTheme="majorHAnsi" w:hAnsiTheme="majorHAnsi"/>
-        </w:rPr>
-      </w:pPr>
-      <w:proofErr w:type="spellStart"/>
-      <w:r>
-        <w:rPr>
-          <w:rFonts w:asciiTheme="majorHAnsi" w:hAnsiTheme="majorHAnsi"/>
-          <w:b/>
-        </w:rPr>
-        <w:t>capScore</w:t>
-      </w:r>
-      <w:proofErr w:type="spellEnd"/>
-      <w:r>
-        <w:rPr>
-          <w:rFonts w:asciiTheme="majorHAnsi" w:hAnsiTheme="majorHAnsi"/>
-          <w:b/>
-        </w:rPr>
-        <w:t xml:space="preserve"> (default </w:t>
-      </w:r>
-      <w:r>
-        <w:rPr>
-          <w:rFonts w:asciiTheme="majorHAnsi" w:hAnsiTheme="majorHAnsi"/>
-          <w:b/>
-        </w:rPr>
-        <w:t>=100</w:t>
-      </w:r>
-      <w:r>
-        <w:rPr>
-          <w:rFonts w:asciiTheme="majorHAnsi" w:hAnsiTheme="majorHAnsi"/>
-          <w:b/>
-        </w:rPr>
-        <w:t>)</w:t>
-      </w:r>
-      <w:r>
-        <w:rPr>
-          <w:rFonts w:asciiTheme="majorHAnsi" w:hAnsiTheme="majorHAnsi"/>
-        </w:rPr>
-        <w:t xml:space="preserve"> – if 2 or more groups have different non-reference allele SNPs</w:t>
-      </w:r>
-      <w:r>
-        <w:rPr>
-          <w:rFonts w:asciiTheme="majorHAnsi" w:hAnsiTheme="majorHAnsi"/>
-        </w:rPr>
-        <w:t xml:space="preserve"> at the exact same site</w:t>
-      </w:r>
-      <w:r>
-        <w:rPr>
-          <w:rFonts w:asciiTheme="majorHAnsi" w:hAnsiTheme="majorHAnsi"/>
-        </w:rPr>
-        <w:t>, the difference in their score</w:t>
-      </w:r>
-      <w:r>
-        <w:rPr>
-          <w:rFonts w:asciiTheme="majorHAnsi" w:hAnsiTheme="majorHAnsi"/>
-        </w:rPr>
-        <w:t>s will be set to larger than the highest possible score.  This feature lets us find highly variant sites where just being ‘different from the reference’ is not the only criteria.  To enable this highly variant search, raise the value above 100 up to a maximum of 200.</w:t>
-      </w:r>
-    </w:p>
-    <w:p>
-      <w:pPr>
-        <w:pStyle w:val="ListParagraph"/>
-        <w:rPr>
-          <w:rFonts w:asciiTheme="majorHAnsi" w:hAnsiTheme="majorHAnsi"/>
-        </w:rPr>
-      </w:pPr>
-    </w:p>
-    <w:p>
-      <w:pPr>
-        <w:ind w:left="720"/>
-        <w:rPr>
-          <w:rFonts w:asciiTheme="majorHAnsi" w:hAnsiTheme="majorHAnsi"/>
-          <w:b/>
-          <w:sz w:val="28"/>
-        </w:rPr>
-      </w:pPr>
-      <w:r>
-        <w:rPr>
-          <w:rFonts w:asciiTheme="majorHAnsi" w:hAnsiTheme="majorHAnsi"/>
-          <w:b/>
-          <w:sz w:val="28"/>
-        </w:rPr>
-        <w:t>7.</w:t>
-      </w:r>
-      <w:r>
-        <w:rPr>
-          <w:rFonts w:asciiTheme="majorHAnsi" w:hAnsiTheme="majorHAnsi"/>
-          <w:b/>
-          <w:sz w:val="28"/>
-        </w:rPr>
-        <w:t xml:space="preserve">2.4.   Write &amp; </w:t>
-      </w:r>
-      <w:r>
-        <w:rPr>
-          <w:rFonts w:asciiTheme="majorHAnsi" w:hAnsiTheme="majorHAnsi"/>
-          <w:b/>
-          <w:sz w:val="28"/>
-        </w:rPr>
-        <w:t>p</w:t>
-      </w:r>
-      <w:r>
-        <w:rPr>
-          <w:rFonts w:asciiTheme="majorHAnsi" w:hAnsiTheme="majorHAnsi"/>
-          <w:b/>
-          <w:sz w:val="28"/>
-        </w:rPr>
-        <w:t xml:space="preserve">lot differential SNPs </w:t>
-      </w:r>
-      <w:r>
-        <w:rPr>
-          <w:rFonts w:asciiTheme="majorHAnsi" w:hAnsiTheme="majorHAnsi"/>
-          <w:b/>
-          <w:sz w:val="28"/>
-        </w:rPr>
-        <w:t>results</w:t>
-      </w:r>
-      <w:r>
-        <w:rPr>
-          <w:rFonts w:asciiTheme="majorHAnsi" w:hAnsiTheme="majorHAnsi"/>
-          <w:b/>
-          <w:sz w:val="28"/>
-        </w:rPr>
-        <w:t>:</w:t>
-      </w:r>
-    </w:p>
-    <w:p>
-      <w:pPr>
-        <w:pStyle w:val="ListParagraph"/>
       </w:pPr>
       <w:r>
         <w:t xml:space="preserve">Run </w:t>
@@ -14303,17 +14390,27 @@
         <w:t>function</w:t>
       </w:r>
       <w:r>
-        <w:t xml:space="preserve">  “</w:t>
-      </w:r>
-      <w:proofErr w:type="gramEnd"/>
-      <w:r>
-        <w:t xml:space="preserve">pipe.VariantCompare2html()”  on the </w:t>
-      </w:r>
-      <w:proofErr w:type="spellStart"/>
+        <w:t xml:space="preserve">  “pipe.VariantCompare</w:t>
+      </w:r>
+      <w:proofErr w:type="gramEnd"/>
+      <w:r>
+        <w:t>2</w:t>
+      </w:r>
+      <w:proofErr w:type="gramStart"/>
+      <w:r>
+        <w:t>html()”  on</w:t>
+      </w:r>
+      <w:proofErr w:type="gramEnd"/>
+      <w:r>
+        <w:t xml:space="preserve"> the </w:t>
+      </w:r>
+      <w:proofErr w:type="spellStart"/>
+      <w:proofErr w:type="gramStart"/>
       <w:r>
         <w:t>data.frame</w:t>
       </w:r>
       <w:proofErr w:type="spellEnd"/>
+      <w:proofErr w:type="gramEnd"/>
       <w:r>
         <w:t xml:space="preserve"> </w:t>
       </w:r>
@@ -14879,7 +14976,15 @@
       </w:r>
       <w:proofErr w:type="gramEnd"/>
       <w:r>
-        <w:t xml:space="preserve">peakdraw.sh” and “multiPeakDraw.sh”.   They contain the final settings regarding negative control peaks and scaling.   They are similar to the batch job submission </w:t>
+        <w:t xml:space="preserve">peakdraw.sh” and “multiPeakDraw.sh”.   They contain the final settings regarding negative control peaks and scaling.   They are </w:t>
+      </w:r>
+      <w:proofErr w:type="gramStart"/>
+      <w:r>
+        <w:t>similar to</w:t>
+      </w:r>
+      <w:proofErr w:type="gramEnd"/>
+      <w:r>
+        <w:t xml:space="preserve"> the batch job submission </w:t>
       </w:r>
       <w:proofErr w:type="gramStart"/>
       <w:r>
@@ -15123,15 +15228,7 @@
       </w:r>
       <w:proofErr w:type="spellEnd"/>
       <w:r>
-        <w:t xml:space="preserve">), via nonlinear least squares optimization.  The result is a single model peak that best approximates the raw read depths over that region for </w:t>
-      </w:r>
-      <w:proofErr w:type="gramStart"/>
-      <w:r>
-        <w:t>that extrema</w:t>
-      </w:r>
-      <w:proofErr w:type="gramEnd"/>
-      <w:r>
-        <w:t xml:space="preserve"> point.  The model peak will have several attributes defining its location, shape, and quality:</w:t>
+        <w:t>), via nonlinear least squares optimization.  The result is a single model peak that best approximates the raw read depths over that region for that extrema point.  The model peak will have several attributes defining its location, shape, and quality:</w:t>
       </w:r>
     </w:p>
     <w:p>
@@ -15245,7 +15342,15 @@
       </w:r>
       <w:r>
         <w:tab/>
-        <w:t>total volume inside the model peak; similar to ‘area under the curve</w:t>
+        <w:t xml:space="preserve">total volume inside the model peak; </w:t>
+      </w:r>
+      <w:proofErr w:type="gramStart"/>
+      <w:r>
+        <w:t>similar to</w:t>
+      </w:r>
+      <w:proofErr w:type="gramEnd"/>
+      <w:r>
+        <w:t xml:space="preserve"> ‘area under the curve</w:t>
       </w:r>
       <w:proofErr w:type="gramStart"/>
       <w:r>
@@ -15984,10 +16089,12 @@
         <w:t>, “</w:t>
       </w:r>
       <w:proofErr w:type="spellStart"/>
+      <w:proofErr w:type="gramStart"/>
       <w:r>
         <w:t>max.width</w:t>
       </w:r>
       <w:proofErr w:type="spellEnd"/>
+      <w:proofErr w:type="gramEnd"/>
       <w:r>
         <w:t>=1000</w:t>
       </w:r>
@@ -16093,15 +16200,7 @@
         <w:t>pulse</w:t>
       </w:r>
       <w:r>
-        <w:t xml:space="preserve">), via nonlinear least squares optimization.  The result is a single model peak that best approximates the raw read depths over that region for </w:t>
-      </w:r>
-      <w:proofErr w:type="gramStart"/>
-      <w:r>
-        <w:t>that extrema</w:t>
-      </w:r>
-      <w:proofErr w:type="gramEnd"/>
-      <w:r>
-        <w:t xml:space="preserve"> point.  The model peak will have several attributes defining its location, shape, and quality:</w:t>
+        <w:t>), via nonlinear least squares optimization.  The result is a single model peak that best approximates the raw read depths over that region for that extrema point.  The model peak will have several attributes defining its location, shape, and quality:</w:t>
       </w:r>
     </w:p>
     <w:p>
@@ -16214,7 +16313,15 @@
       </w:r>
       <w:r>
         <w:tab/>
-        <w:t>total volume inside the model peak; similar to ‘area under the curve</w:t>
+        <w:t xml:space="preserve">total volume inside the model peak; </w:t>
+      </w:r>
+      <w:proofErr w:type="gramStart"/>
+      <w:r>
+        <w:t>similar to</w:t>
+      </w:r>
+      <w:proofErr w:type="gramEnd"/>
+      <w:r>
+        <w:t xml:space="preserve"> ‘area under the curve</w:t>
       </w:r>
       <w:proofErr w:type="gramStart"/>
       <w:r>
@@ -16920,6 +17027,7 @@
         <w:t xml:space="preserve">  run R function </w:t>
       </w:r>
       <w:proofErr w:type="spellStart"/>
+      <w:proofErr w:type="gramStart"/>
       <w:r>
         <w:rPr>
           <w:rFonts w:ascii="Courier New" w:hAnsi="Courier New"/>
@@ -16927,6 +17035,7 @@
         <w:t>pipe.Transcriptome</w:t>
       </w:r>
       <w:proofErr w:type="spellEnd"/>
+      <w:proofErr w:type="gramEnd"/>
       <w:r>
         <w:rPr>
           <w:rFonts w:ascii="Courier New" w:hAnsi="Courier New"/>
@@ -17188,7 +17297,7 @@
 </file>
 
 <file path=word/endnotes.xml><?xml version="1.0" encoding="utf-8"?>
-<w:endnotes xmlns:wpc="http://schemas.microsoft.com/office/word/2010/wordprocessingCanvas" xmlns:cx="http://schemas.microsoft.com/office/drawing/2014/chartex" xmlns:cx1="http://schemas.microsoft.com/office/drawing/2015/9/8/chartex" xmlns:cx2="http://schemas.microsoft.com/office/drawing/2015/10/21/chartex" xmlns:cx3="http://schemas.microsoft.com/office/drawing/2016/5/9/chartex" xmlns:cx4="http://schemas.microsoft.com/office/drawing/2016/5/10/chartex" xmlns:cx5="http://schemas.microsoft.com/office/drawing/2016/5/11/chartex" xmlns:cx6="http://schemas.microsoft.com/office/drawing/2016/5/12/chartex" xmlns:cx7="http://schemas.microsoft.com/office/drawing/2016/5/13/chartex" xmlns:cx8="http://schemas.microsoft.com/office/drawing/2016/5/14/chartex" xmlns:mc="http://schemas.openxmlformats.org/markup-compatibility/2006" xmlns:aink="http://schemas.microsoft.com/office/drawing/2016/ink" xmlns:am3d="http://schemas.microsoft.com/office/drawing/2017/model3d" xmlns:o="urn:schemas-microsoft-com:office:office" xmlns:oel="http://schemas.microsoft.com/office/2019/extlst" xmlns:r="http://schemas.openxmlformats.org/officeDocument/2006/relationships" xmlns:m="http://schemas.openxmlformats.org/officeDocument/2006/math" xmlns:v="urn:schemas-microsoft-com:vml" xmlns:wp14="http://schemas.microsoft.com/office/word/2010/wordprocessingDrawing" xmlns:wp="http://schemas.openxmlformats.org/drawingml/2006/wordprocessingDrawing" xmlns:w10="urn:schemas-microsoft-com:office:word" xmlns:w="http://schemas.openxmlformats.org/wordprocessingml/2006/main" xmlns:w14="http://schemas.microsoft.com/office/word/2010/wordml" xmlns:w15="http://schemas.microsoft.com/office/word/2012/wordml" xmlns:w16cex="http://schemas.microsoft.com/office/word/2018/wordml/cex" xmlns:w16cid="http://schemas.microsoft.com/office/word/2016/wordml/cid" xmlns:w16="http://schemas.microsoft.com/office/word/2018/wordml" xmlns:w16sdtdh="http://schemas.microsoft.com/office/word/2020/wordml/sdtdatahash" xmlns:w16se="http://schemas.microsoft.com/office/word/2015/wordml/symex" xmlns:wpg="http://schemas.microsoft.com/office/word/2010/wordprocessingGroup" xmlns:wpi="http://schemas.microsoft.com/office/word/2010/wordprocessingInk" xmlns:wne="http://schemas.microsoft.com/office/word/2006/wordml" xmlns:wps="http://schemas.microsoft.com/office/word/2010/wordprocessingShape" mc:Ignorable="w14 w15 w16se w16cid w16 w16cex w16sdtdh wp14">
+<w:endnotes xmlns:wpc="http://schemas.microsoft.com/office/word/2010/wordprocessingCanvas" xmlns:cx="http://schemas.microsoft.com/office/drawing/2014/chartex" xmlns:cx1="http://schemas.microsoft.com/office/drawing/2015/9/8/chartex" xmlns:cx2="http://schemas.microsoft.com/office/drawing/2015/10/21/chartex" xmlns:cx3="http://schemas.microsoft.com/office/drawing/2016/5/9/chartex" xmlns:cx4="http://schemas.microsoft.com/office/drawing/2016/5/10/chartex" xmlns:cx5="http://schemas.microsoft.com/office/drawing/2016/5/11/chartex" xmlns:cx6="http://schemas.microsoft.com/office/drawing/2016/5/12/chartex" xmlns:cx7="http://schemas.microsoft.com/office/drawing/2016/5/13/chartex" xmlns:cx8="http://schemas.microsoft.com/office/drawing/2016/5/14/chartex" xmlns:mc="http://schemas.openxmlformats.org/markup-compatibility/2006" xmlns:aink="http://schemas.microsoft.com/office/drawing/2016/ink" xmlns:am3d="http://schemas.microsoft.com/office/drawing/2017/model3d" xmlns:o="urn:schemas-microsoft-com:office:office" xmlns:oel="http://schemas.microsoft.com/office/2019/extlst" xmlns:r="http://schemas.openxmlformats.org/officeDocument/2006/relationships" xmlns:m="http://schemas.openxmlformats.org/officeDocument/2006/math" xmlns:v="urn:schemas-microsoft-com:vml" xmlns:wp14="http://schemas.microsoft.com/office/word/2010/wordprocessingDrawing" xmlns:wp="http://schemas.openxmlformats.org/drawingml/2006/wordprocessingDrawing" xmlns:w10="urn:schemas-microsoft-com:office:word" xmlns:w="http://schemas.openxmlformats.org/wordprocessingml/2006/main" xmlns:w14="http://schemas.microsoft.com/office/word/2010/wordml" xmlns:w15="http://schemas.microsoft.com/office/word/2012/wordml" xmlns:w16cex="http://schemas.microsoft.com/office/word/2018/wordml/cex" xmlns:w16cid="http://schemas.microsoft.com/office/word/2016/wordml/cid" xmlns:w16="http://schemas.microsoft.com/office/word/2018/wordml" xmlns:w16du="http://schemas.microsoft.com/office/word/2023/wordml/word16du" xmlns:w16sdtdh="http://schemas.microsoft.com/office/word/2020/wordml/sdtdatahash" xmlns:w16sdtfl="http://schemas.microsoft.com/office/word/2024/wordml/sdtformatlock" xmlns:w16se="http://schemas.microsoft.com/office/word/2015/wordml/symex" xmlns:wpg="http://schemas.microsoft.com/office/word/2010/wordprocessingGroup" xmlns:wpi="http://schemas.microsoft.com/office/word/2010/wordprocessingInk" xmlns:wne="http://schemas.microsoft.com/office/word/2006/wordml" xmlns:wps="http://schemas.microsoft.com/office/word/2010/wordprocessingShape" mc:Ignorable="w14 w15 w16se w16cid w16 w16cex w16sdtdh w16sdtfl w16du wp14">
   <w:endnote w:type="separator" w:id="-1">
     <w:p>
       <w:r>
@@ -17207,7 +17316,7 @@
 </file>
 
 <file path=word/footnotes.xml><?xml version="1.0" encoding="utf-8"?>
-<w:footnotes xmlns:wpc="http://schemas.microsoft.com/office/word/2010/wordprocessingCanvas" xmlns:cx="http://schemas.microsoft.com/office/drawing/2014/chartex" xmlns:cx1="http://schemas.microsoft.com/office/drawing/2015/9/8/chartex" xmlns:cx2="http://schemas.microsoft.com/office/drawing/2015/10/21/chartex" xmlns:cx3="http://schemas.microsoft.com/office/drawing/2016/5/9/chartex" xmlns:cx4="http://schemas.microsoft.com/office/drawing/2016/5/10/chartex" xmlns:cx5="http://schemas.microsoft.com/office/drawing/2016/5/11/chartex" xmlns:cx6="http://schemas.microsoft.com/office/drawing/2016/5/12/chartex" xmlns:cx7="http://schemas.microsoft.com/office/drawing/2016/5/13/chartex" xmlns:cx8="http://schemas.microsoft.com/office/drawing/2016/5/14/chartex" xmlns:mc="http://schemas.openxmlformats.org/markup-compatibility/2006" xmlns:aink="http://schemas.microsoft.com/office/drawing/2016/ink" xmlns:am3d="http://schemas.microsoft.com/office/drawing/2017/model3d" xmlns:o="urn:schemas-microsoft-com:office:office" xmlns:oel="http://schemas.microsoft.com/office/2019/extlst" xmlns:r="http://schemas.openxmlformats.org/officeDocument/2006/relationships" xmlns:m="http://schemas.openxmlformats.org/officeDocument/2006/math" xmlns:v="urn:schemas-microsoft-com:vml" xmlns:wp14="http://schemas.microsoft.com/office/word/2010/wordprocessingDrawing" xmlns:wp="http://schemas.openxmlformats.org/drawingml/2006/wordprocessingDrawing" xmlns:w10="urn:schemas-microsoft-com:office:word" xmlns:w="http://schemas.openxmlformats.org/wordprocessingml/2006/main" xmlns:w14="http://schemas.microsoft.com/office/word/2010/wordml" xmlns:w15="http://schemas.microsoft.com/office/word/2012/wordml" xmlns:w16cex="http://schemas.microsoft.com/office/word/2018/wordml/cex" xmlns:w16cid="http://schemas.microsoft.com/office/word/2016/wordml/cid" xmlns:w16="http://schemas.microsoft.com/office/word/2018/wordml" xmlns:w16sdtdh="http://schemas.microsoft.com/office/word/2020/wordml/sdtdatahash" xmlns:w16se="http://schemas.microsoft.com/office/word/2015/wordml/symex" xmlns:wpg="http://schemas.microsoft.com/office/word/2010/wordprocessingGroup" xmlns:wpi="http://schemas.microsoft.com/office/word/2010/wordprocessingInk" xmlns:wne="http://schemas.microsoft.com/office/word/2006/wordml" xmlns:wps="http://schemas.microsoft.com/office/word/2010/wordprocessingShape" mc:Ignorable="w14 w15 w16se w16cid w16 w16cex w16sdtdh wp14">
+<w:footnotes xmlns:wpc="http://schemas.microsoft.com/office/word/2010/wordprocessingCanvas" xmlns:cx="http://schemas.microsoft.com/office/drawing/2014/chartex" xmlns:cx1="http://schemas.microsoft.com/office/drawing/2015/9/8/chartex" xmlns:cx2="http://schemas.microsoft.com/office/drawing/2015/10/21/chartex" xmlns:cx3="http://schemas.microsoft.com/office/drawing/2016/5/9/chartex" xmlns:cx4="http://schemas.microsoft.com/office/drawing/2016/5/10/chartex" xmlns:cx5="http://schemas.microsoft.com/office/drawing/2016/5/11/chartex" xmlns:cx6="http://schemas.microsoft.com/office/drawing/2016/5/12/chartex" xmlns:cx7="http://schemas.microsoft.com/office/drawing/2016/5/13/chartex" xmlns:cx8="http://schemas.microsoft.com/office/drawing/2016/5/14/chartex" xmlns:mc="http://schemas.openxmlformats.org/markup-compatibility/2006" xmlns:aink="http://schemas.microsoft.com/office/drawing/2016/ink" xmlns:am3d="http://schemas.microsoft.com/office/drawing/2017/model3d" xmlns:o="urn:schemas-microsoft-com:office:office" xmlns:oel="http://schemas.microsoft.com/office/2019/extlst" xmlns:r="http://schemas.openxmlformats.org/officeDocument/2006/relationships" xmlns:m="http://schemas.openxmlformats.org/officeDocument/2006/math" xmlns:v="urn:schemas-microsoft-com:vml" xmlns:wp14="http://schemas.microsoft.com/office/word/2010/wordprocessingDrawing" xmlns:wp="http://schemas.openxmlformats.org/drawingml/2006/wordprocessingDrawing" xmlns:w10="urn:schemas-microsoft-com:office:word" xmlns:w="http://schemas.openxmlformats.org/wordprocessingml/2006/main" xmlns:w14="http://schemas.microsoft.com/office/word/2010/wordml" xmlns:w15="http://schemas.microsoft.com/office/word/2012/wordml" xmlns:w16cex="http://schemas.microsoft.com/office/word/2018/wordml/cex" xmlns:w16cid="http://schemas.microsoft.com/office/word/2016/wordml/cid" xmlns:w16="http://schemas.microsoft.com/office/word/2018/wordml" xmlns:w16du="http://schemas.microsoft.com/office/word/2023/wordml/word16du" xmlns:w16sdtdh="http://schemas.microsoft.com/office/word/2020/wordml/sdtdatahash" xmlns:w16sdtfl="http://schemas.microsoft.com/office/word/2024/wordml/sdtformatlock" xmlns:w16se="http://schemas.microsoft.com/office/word/2015/wordml/symex" xmlns:wpg="http://schemas.microsoft.com/office/word/2010/wordprocessingGroup" xmlns:wpi="http://schemas.microsoft.com/office/word/2010/wordprocessingInk" xmlns:wne="http://schemas.microsoft.com/office/word/2006/wordml" xmlns:wps="http://schemas.microsoft.com/office/word/2010/wordprocessingShape" mc:Ignorable="w14 w15 w16se w16cid w16 w16cex w16sdtdh w16sdtfl w16du wp14">
   <w:footnote w:type="separator" w:id="-1">
     <w:p>
       <w:r>
@@ -17226,7 +17335,7 @@
 </file>
 
 <file path=word/header1.xml><?xml version="1.0" encoding="utf-8"?>
-<w:hdr xmlns:wpc="http://schemas.microsoft.com/office/word/2010/wordprocessingCanvas" xmlns:cx="http://schemas.microsoft.com/office/drawing/2014/chartex" xmlns:cx1="http://schemas.microsoft.com/office/drawing/2015/9/8/chartex" xmlns:cx2="http://schemas.microsoft.com/office/drawing/2015/10/21/chartex" xmlns:cx3="http://schemas.microsoft.com/office/drawing/2016/5/9/chartex" xmlns:cx4="http://schemas.microsoft.com/office/drawing/2016/5/10/chartex" xmlns:cx5="http://schemas.microsoft.com/office/drawing/2016/5/11/chartex" xmlns:cx6="http://schemas.microsoft.com/office/drawing/2016/5/12/chartex" xmlns:cx7="http://schemas.microsoft.com/office/drawing/2016/5/13/chartex" xmlns:cx8="http://schemas.microsoft.com/office/drawing/2016/5/14/chartex" xmlns:mc="http://schemas.openxmlformats.org/markup-compatibility/2006" xmlns:aink="http://schemas.microsoft.com/office/drawing/2016/ink" xmlns:am3d="http://schemas.microsoft.com/office/drawing/2017/model3d" xmlns:o="urn:schemas-microsoft-com:office:office" xmlns:oel="http://schemas.microsoft.com/office/2019/extlst" xmlns:r="http://schemas.openxmlformats.org/officeDocument/2006/relationships" xmlns:m="http://schemas.openxmlformats.org/officeDocument/2006/math" xmlns:v="urn:schemas-microsoft-com:vml" xmlns:wp14="http://schemas.microsoft.com/office/word/2010/wordprocessingDrawing" xmlns:wp="http://schemas.openxmlformats.org/drawingml/2006/wordprocessingDrawing" xmlns:w10="urn:schemas-microsoft-com:office:word" xmlns:w="http://schemas.openxmlformats.org/wordprocessingml/2006/main" xmlns:w14="http://schemas.microsoft.com/office/word/2010/wordml" xmlns:w15="http://schemas.microsoft.com/office/word/2012/wordml" xmlns:w16cex="http://schemas.microsoft.com/office/word/2018/wordml/cex" xmlns:w16cid="http://schemas.microsoft.com/office/word/2016/wordml/cid" xmlns:w16="http://schemas.microsoft.com/office/word/2018/wordml" xmlns:w16sdtdh="http://schemas.microsoft.com/office/word/2020/wordml/sdtdatahash" xmlns:w16se="http://schemas.microsoft.com/office/word/2015/wordml/symex" xmlns:wpg="http://schemas.microsoft.com/office/word/2010/wordprocessingGroup" xmlns:wpi="http://schemas.microsoft.com/office/word/2010/wordprocessingInk" xmlns:wne="http://schemas.microsoft.com/office/word/2006/wordml" xmlns:wps="http://schemas.microsoft.com/office/word/2010/wordprocessingShape" mc:Ignorable="w14 w15 w16se w16cid w16 w16cex w16sdtdh wp14">
+<w:hdr xmlns:wpc="http://schemas.microsoft.com/office/word/2010/wordprocessingCanvas" xmlns:cx="http://schemas.microsoft.com/office/drawing/2014/chartex" xmlns:cx1="http://schemas.microsoft.com/office/drawing/2015/9/8/chartex" xmlns:cx2="http://schemas.microsoft.com/office/drawing/2015/10/21/chartex" xmlns:cx3="http://schemas.microsoft.com/office/drawing/2016/5/9/chartex" xmlns:cx4="http://schemas.microsoft.com/office/drawing/2016/5/10/chartex" xmlns:cx5="http://schemas.microsoft.com/office/drawing/2016/5/11/chartex" xmlns:cx6="http://schemas.microsoft.com/office/drawing/2016/5/12/chartex" xmlns:cx7="http://schemas.microsoft.com/office/drawing/2016/5/13/chartex" xmlns:cx8="http://schemas.microsoft.com/office/drawing/2016/5/14/chartex" xmlns:mc="http://schemas.openxmlformats.org/markup-compatibility/2006" xmlns:aink="http://schemas.microsoft.com/office/drawing/2016/ink" xmlns:am3d="http://schemas.microsoft.com/office/drawing/2017/model3d" xmlns:o="urn:schemas-microsoft-com:office:office" xmlns:oel="http://schemas.microsoft.com/office/2019/extlst" xmlns:r="http://schemas.openxmlformats.org/officeDocument/2006/relationships" xmlns:m="http://schemas.openxmlformats.org/officeDocument/2006/math" xmlns:v="urn:schemas-microsoft-com:vml" xmlns:wp14="http://schemas.microsoft.com/office/word/2010/wordprocessingDrawing" xmlns:wp="http://schemas.openxmlformats.org/drawingml/2006/wordprocessingDrawing" xmlns:w10="urn:schemas-microsoft-com:office:word" xmlns:w="http://schemas.openxmlformats.org/wordprocessingml/2006/main" xmlns:w14="http://schemas.microsoft.com/office/word/2010/wordml" xmlns:w15="http://schemas.microsoft.com/office/word/2012/wordml" xmlns:w16cex="http://schemas.microsoft.com/office/word/2018/wordml/cex" xmlns:w16cid="http://schemas.microsoft.com/office/word/2016/wordml/cid" xmlns:w16="http://schemas.microsoft.com/office/word/2018/wordml" xmlns:w16du="http://schemas.microsoft.com/office/word/2023/wordml/word16du" xmlns:w16sdtdh="http://schemas.microsoft.com/office/word/2020/wordml/sdtdatahash" xmlns:w16sdtfl="http://schemas.microsoft.com/office/word/2024/wordml/sdtformatlock" xmlns:w16se="http://schemas.microsoft.com/office/word/2015/wordml/symex" xmlns:wpg="http://schemas.microsoft.com/office/word/2010/wordprocessingGroup" xmlns:wpi="http://schemas.microsoft.com/office/word/2010/wordprocessingInk" xmlns:wne="http://schemas.microsoft.com/office/word/2006/wordml" xmlns:wps="http://schemas.microsoft.com/office/word/2010/wordprocessingShape" mc:Ignorable="w14 w15 w16se w16cid w16 w16cex w16sdtdh w16sdtfl w16du wp14">
   <w:p>
     <w:pPr>
       <w:pStyle w:val="Header"/>
@@ -17236,26 +17345,23 @@
       <w:t xml:space="preserve">As of </w:t>
     </w:r>
     <w:r>
-      <w:t>7</w:t>
-    </w:r>
-    <w:r>
-      <w:t>-</w:t>
-    </w:r>
-    <w:r>
-      <w:t>Jul</w:t>
+      <w:t>May</w:t>
     </w:r>
     <w:r>
       <w:t>-20</w:t>
     </w:r>
     <w:r>
-      <w:t>20</w:t>
+      <w:t>2</w:t>
+    </w:r>
+    <w:r>
+      <w:t>6</w:t>
     </w:r>
   </w:p>
 </w:hdr>
 </file>
 
 <file path=word/numbering.xml><?xml version="1.0" encoding="utf-8"?>
-<w:numbering xmlns:wpc="http://schemas.microsoft.com/office/word/2010/wordprocessingCanvas" xmlns:cx="http://schemas.microsoft.com/office/drawing/2014/chartex" xmlns:cx1="http://schemas.microsoft.com/office/drawing/2015/9/8/chartex" xmlns:cx2="http://schemas.microsoft.com/office/drawing/2015/10/21/chartex" xmlns:cx3="http://schemas.microsoft.com/office/drawing/2016/5/9/chartex" xmlns:cx4="http://schemas.microsoft.com/office/drawing/2016/5/10/chartex" xmlns:cx5="http://schemas.microsoft.com/office/drawing/2016/5/11/chartex" xmlns:cx6="http://schemas.microsoft.com/office/drawing/2016/5/12/chartex" xmlns:cx7="http://schemas.microsoft.com/office/drawing/2016/5/13/chartex" xmlns:cx8="http://schemas.microsoft.com/office/drawing/2016/5/14/chartex" xmlns:mc="http://schemas.openxmlformats.org/markup-compatibility/2006" xmlns:aink="http://schemas.microsoft.com/office/drawing/2016/ink" xmlns:am3d="http://schemas.microsoft.com/office/drawing/2017/model3d" xmlns:o="urn:schemas-microsoft-com:office:office" xmlns:oel="http://schemas.microsoft.com/office/2019/extlst" xmlns:r="http://schemas.openxmlformats.org/officeDocument/2006/relationships" xmlns:m="http://schemas.openxmlformats.org/officeDocument/2006/math" xmlns:v="urn:schemas-microsoft-com:vml" xmlns:wp14="http://schemas.microsoft.com/office/word/2010/wordprocessingDrawing" xmlns:wp="http://schemas.openxmlformats.org/drawingml/2006/wordprocessingDrawing" xmlns:w10="urn:schemas-microsoft-com:office:word" xmlns:w="http://schemas.openxmlformats.org/wordprocessingml/2006/main" xmlns:w14="http://schemas.microsoft.com/office/word/2010/wordml" xmlns:w15="http://schemas.microsoft.com/office/word/2012/wordml" xmlns:w16cex="http://schemas.microsoft.com/office/word/2018/wordml/cex" xmlns:w16cid="http://schemas.microsoft.com/office/word/2016/wordml/cid" xmlns:w16="http://schemas.microsoft.com/office/word/2018/wordml" xmlns:w16sdtdh="http://schemas.microsoft.com/office/word/2020/wordml/sdtdatahash" xmlns:w16se="http://schemas.microsoft.com/office/word/2015/wordml/symex" xmlns:wpg="http://schemas.microsoft.com/office/word/2010/wordprocessingGroup" xmlns:wpi="http://schemas.microsoft.com/office/word/2010/wordprocessingInk" xmlns:wne="http://schemas.microsoft.com/office/word/2006/wordml" xmlns:wps="http://schemas.microsoft.com/office/word/2010/wordprocessingShape" mc:Ignorable="w14 w15 w16se w16cid w16 w16cex w16sdtdh wp14">
+<w:numbering xmlns:wpc="http://schemas.microsoft.com/office/word/2010/wordprocessingCanvas" xmlns:cx="http://schemas.microsoft.com/office/drawing/2014/chartex" xmlns:cx1="http://schemas.microsoft.com/office/drawing/2015/9/8/chartex" xmlns:cx2="http://schemas.microsoft.com/office/drawing/2015/10/21/chartex" xmlns:cx3="http://schemas.microsoft.com/office/drawing/2016/5/9/chartex" xmlns:cx4="http://schemas.microsoft.com/office/drawing/2016/5/10/chartex" xmlns:cx5="http://schemas.microsoft.com/office/drawing/2016/5/11/chartex" xmlns:cx6="http://schemas.microsoft.com/office/drawing/2016/5/12/chartex" xmlns:cx7="http://schemas.microsoft.com/office/drawing/2016/5/13/chartex" xmlns:cx8="http://schemas.microsoft.com/office/drawing/2016/5/14/chartex" xmlns:mc="http://schemas.openxmlformats.org/markup-compatibility/2006" xmlns:aink="http://schemas.microsoft.com/office/drawing/2016/ink" xmlns:am3d="http://schemas.microsoft.com/office/drawing/2017/model3d" xmlns:o="urn:schemas-microsoft-com:office:office" xmlns:oel="http://schemas.microsoft.com/office/2019/extlst" xmlns:r="http://schemas.openxmlformats.org/officeDocument/2006/relationships" xmlns:m="http://schemas.openxmlformats.org/officeDocument/2006/math" xmlns:v="urn:schemas-microsoft-com:vml" xmlns:wp14="http://schemas.microsoft.com/office/word/2010/wordprocessingDrawing" xmlns:wp="http://schemas.openxmlformats.org/drawingml/2006/wordprocessingDrawing" xmlns:w10="urn:schemas-microsoft-com:office:word" xmlns:w="http://schemas.openxmlformats.org/wordprocessingml/2006/main" xmlns:w14="http://schemas.microsoft.com/office/word/2010/wordml" xmlns:w15="http://schemas.microsoft.com/office/word/2012/wordml" xmlns:w16cex="http://schemas.microsoft.com/office/word/2018/wordml/cex" xmlns:w16cid="http://schemas.microsoft.com/office/word/2016/wordml/cid" xmlns:w16="http://schemas.microsoft.com/office/word/2018/wordml" xmlns:w16du="http://schemas.microsoft.com/office/word/2023/wordml/word16du" xmlns:w16sdtdh="http://schemas.microsoft.com/office/word/2020/wordml/sdtdatahash" xmlns:w16sdtfl="http://schemas.microsoft.com/office/word/2024/wordml/sdtformatlock" xmlns:w16se="http://schemas.microsoft.com/office/word/2015/wordml/symex" xmlns:wpg="http://schemas.microsoft.com/office/word/2010/wordprocessingGroup" xmlns:wpi="http://schemas.microsoft.com/office/word/2010/wordprocessingInk" xmlns:wne="http://schemas.microsoft.com/office/word/2006/wordml" xmlns:wps="http://schemas.microsoft.com/office/word/2010/wordprocessingShape" mc:Ignorable="w14 w15 w16se w16cid w16 w16cex w16sdtdh w16sdtfl w16du wp14">
   <w:abstractNum w:abstractNumId="0" w15:restartNumberingAfterBreak="0">
     <w:nsid w:val="0F027B60"/>
     <w:multiLevelType w:val="hybridMultilevel"/>
@@ -17816,7 +17922,7 @@
 </file>
 
 <file path=word/styles.xml><?xml version="1.0" encoding="utf-8"?>
-<w:styles xmlns:mc="http://schemas.openxmlformats.org/markup-compatibility/2006" xmlns:r="http://schemas.openxmlformats.org/officeDocument/2006/relationships" xmlns:w="http://schemas.openxmlformats.org/wordprocessingml/2006/main" xmlns:w14="http://schemas.microsoft.com/office/word/2010/wordml" xmlns:w15="http://schemas.microsoft.com/office/word/2012/wordml" xmlns:w16cex="http://schemas.microsoft.com/office/word/2018/wordml/cex" xmlns:w16cid="http://schemas.microsoft.com/office/word/2016/wordml/cid" xmlns:w16="http://schemas.microsoft.com/office/word/2018/wordml" xmlns:w16sdtdh="http://schemas.microsoft.com/office/word/2020/wordml/sdtdatahash" xmlns:w16se="http://schemas.microsoft.com/office/word/2015/wordml/symex" mc:Ignorable="w14 w15 w16se w16cid w16 w16cex w16sdtdh">
+<w:styles xmlns:mc="http://schemas.openxmlformats.org/markup-compatibility/2006" xmlns:r="http://schemas.openxmlformats.org/officeDocument/2006/relationships" xmlns:w="http://schemas.openxmlformats.org/wordprocessingml/2006/main" xmlns:w14="http://schemas.microsoft.com/office/word/2010/wordml" xmlns:w15="http://schemas.microsoft.com/office/word/2012/wordml" xmlns:w16cex="http://schemas.microsoft.com/office/word/2018/wordml/cex" xmlns:w16cid="http://schemas.microsoft.com/office/word/2016/wordml/cid" xmlns:w16="http://schemas.microsoft.com/office/word/2018/wordml" xmlns:w16du="http://schemas.microsoft.com/office/word/2023/wordml/word16du" xmlns:w16sdtdh="http://schemas.microsoft.com/office/word/2020/wordml/sdtdatahash" xmlns:w16sdtfl="http://schemas.microsoft.com/office/word/2024/wordml/sdtformatlock" xmlns:w16se="http://schemas.microsoft.com/office/word/2015/wordml/symex" mc:Ignorable="w14 w15 w16se w16cid w16 w16cex w16sdtdh w16sdtfl w16du">
   <w:docDefaults>
     <w:rPrDefault>
       <w:rPr>

</xml_diff>